<commit_message>
forgot pass + reset pass + fetchAPI + tisztabb kepfeltoltes
</commit_message>
<xml_diff>
--- a/docs/CoMove szoftveralkalmazás dokumentációja.docx
+++ b/docs/CoMove szoftveralkalmazás dokumentációja.docx
@@ -17687,6 +17687,12 @@
         <w:t xml:space="preserve"> </w:t>
       </w:r>
       <w:r>
+        <w:t>(</w:t>
+      </w:r>
+      <w:r>
+        <w:t xml:space="preserve">opcionálisan más) </w:t>
+      </w:r>
+      <w:r>
         <w:t>mappába</w:t>
       </w:r>
       <w:r>
@@ -17696,10 +17702,20 @@
         <w:t xml:space="preserve"> </w:t>
       </w:r>
       <w:r>
-        <w:t>Ez</w:t>
-      </w:r>
-      <w:r>
-        <w:t xml:space="preserve"> egy olyan mappa, amelyből az ASP.NET backend, statikus fájlok</w:t>
+        <w:t xml:space="preserve">A </w:t>
+      </w:r>
+      <w:r>
+        <w:rPr>
+          <w:b/>
+          <w:bCs/>
+        </w:rPr>
+        <w:t>wwwroot</w:t>
+      </w:r>
+      <w:r>
+        <w:t xml:space="preserve"> egy</w:t>
+      </w:r>
+      <w:r>
+        <w:t xml:space="preserve"> olyan mappa, amelyből az ASP.NET backend, statikus fájlok</w:t>
       </w:r>
       <w:r>
         <w:t xml:space="preserve">at oszt meg, a mi esetünkben a </w:t>

</xml_diff>

<commit_message>
HTTP profil + loadtest + doksi
</commit_message>
<xml_diff>
--- a/docs/CoMove szoftveralkalmazás dokumentációja.docx
+++ b/docs/CoMove szoftveralkalmazás dokumentációja.docx
@@ -237,7 +237,6 @@
         </w:rPr>
         <w:t xml:space="preserve">A </w:t>
       </w:r>
-      <w:proofErr w:type="spellStart"/>
       <w:r>
         <w:rPr>
           <w:rFonts w:cs="Times New Roman"/>
@@ -245,17 +244,7 @@
           <w:sz w:val="40"/>
           <w:szCs w:val="40"/>
         </w:rPr>
-        <w:t>CoMove</w:t>
-      </w:r>
-      <w:proofErr w:type="spellEnd"/>
-      <w:r>
-        <w:rPr>
-          <w:rFonts w:cs="Times New Roman"/>
-          <w:b/>
-          <w:sz w:val="40"/>
-          <w:szCs w:val="40"/>
-        </w:rPr>
-        <w:t xml:space="preserve"> </w:t>
+        <w:t xml:space="preserve">CoMove </w:t>
       </w:r>
       <w:r>
         <w:rPr>
@@ -479,7 +468,7 @@
       <w:r>
         <w:fldChar w:fldCharType="separate"/>
       </w:r>
-      <w:hyperlink w:anchor="_Toc227277576" w:history="1">
+      <w:hyperlink w:anchor="_Toc227708697" w:history="1">
         <w:r>
           <w:rPr>
             <w:rStyle w:val="Hyperlink"/>
@@ -506,7 +495,7 @@
             <w:noProof/>
             <w:webHidden/>
           </w:rPr>
-          <w:instrText xml:space="preserve"> PAGEREF _Toc227277576 \h </w:instrText>
+          <w:instrText xml:space="preserve"> PAGEREF _Toc227708697 \h </w:instrText>
         </w:r>
         <w:r>
           <w:rPr>
@@ -552,7 +541,7 @@
           <w14:ligatures w14:val="standardContextual"/>
         </w:rPr>
       </w:pPr>
-      <w:hyperlink w:anchor="_Toc227277577" w:history="1">
+      <w:hyperlink w:anchor="_Toc227708698" w:history="1">
         <w:r>
           <w:rPr>
             <w:rStyle w:val="Hyperlink"/>
@@ -579,7 +568,7 @@
             <w:noProof/>
             <w:webHidden/>
           </w:rPr>
-          <w:instrText xml:space="preserve"> PAGEREF _Toc227277577 \h </w:instrText>
+          <w:instrText xml:space="preserve"> PAGEREF _Toc227708698 \h </w:instrText>
         </w:r>
         <w:r>
           <w:rPr>
@@ -625,7 +614,7 @@
           <w14:ligatures w14:val="standardContextual"/>
         </w:rPr>
       </w:pPr>
-      <w:hyperlink w:anchor="_Toc227277578" w:history="1">
+      <w:hyperlink w:anchor="_Toc227708699" w:history="1">
         <w:r>
           <w:rPr>
             <w:rStyle w:val="Hyperlink"/>
@@ -652,7 +641,7 @@
             <w:noProof/>
             <w:webHidden/>
           </w:rPr>
-          <w:instrText xml:space="preserve"> PAGEREF _Toc227277578 \h </w:instrText>
+          <w:instrText xml:space="preserve"> PAGEREF _Toc227708699 \h </w:instrText>
         </w:r>
         <w:r>
           <w:rPr>
@@ -685,7 +674,10 @@
     </w:p>
     <w:p>
       <w:pPr>
-        <w:pStyle w:val="TOC1"/>
+        <w:pStyle w:val="TOC2"/>
+        <w:tabs>
+          <w:tab w:val="right" w:leader="dot" w:pos="8776"/>
+        </w:tabs>
         <w:rPr>
           <w:rFonts w:asciiTheme="minorHAnsi" w:eastAsiaTheme="minorEastAsia" w:hAnsiTheme="minorHAnsi"/>
           <w:noProof/>
@@ -695,13 +687,13 @@
           <w14:ligatures w14:val="standardContextual"/>
         </w:rPr>
       </w:pPr>
-      <w:hyperlink w:anchor="_Toc227277579" w:history="1">
+      <w:hyperlink w:anchor="_Toc227708700" w:history="1">
         <w:r>
           <w:rPr>
             <w:rStyle w:val="Hyperlink"/>
             <w:noProof/>
           </w:rPr>
-          <w:t>Fejlesztői környezet</w:t>
+          <w:t>Hasonló szolgáltatások</w:t>
         </w:r>
         <w:r>
           <w:rPr>
@@ -722,7 +714,7 @@
             <w:noProof/>
             <w:webHidden/>
           </w:rPr>
-          <w:instrText xml:space="preserve"> PAGEREF _Toc227277579 \h </w:instrText>
+          <w:instrText xml:space="preserve"> PAGEREF _Toc227708700 \h </w:instrText>
         </w:r>
         <w:r>
           <w:rPr>
@@ -755,10 +747,7 @@
     </w:p>
     <w:p>
       <w:pPr>
-        <w:pStyle w:val="TOC2"/>
-        <w:tabs>
-          <w:tab w:val="right" w:leader="dot" w:pos="8776"/>
-        </w:tabs>
+        <w:pStyle w:val="TOC1"/>
         <w:rPr>
           <w:rFonts w:asciiTheme="minorHAnsi" w:eastAsiaTheme="minorEastAsia" w:hAnsiTheme="minorHAnsi"/>
           <w:noProof/>
@@ -768,13 +757,13 @@
           <w14:ligatures w14:val="standardContextual"/>
         </w:rPr>
       </w:pPr>
-      <w:hyperlink w:anchor="_Toc227277580" w:history="1">
+      <w:hyperlink w:anchor="_Toc227708701" w:history="1">
         <w:r>
           <w:rPr>
             <w:rStyle w:val="Hyperlink"/>
             <w:noProof/>
           </w:rPr>
-          <w:t>Frontend</w:t>
+          <w:t>A szoftver műszaki feltételei és futtatása</w:t>
         </w:r>
         <w:r>
           <w:rPr>
@@ -795,7 +784,7 @@
             <w:noProof/>
             <w:webHidden/>
           </w:rPr>
-          <w:instrText xml:space="preserve"> PAGEREF _Toc227277580 \h </w:instrText>
+          <w:instrText xml:space="preserve"> PAGEREF _Toc227708701 \h </w:instrText>
         </w:r>
         <w:r>
           <w:rPr>
@@ -815,7 +804,7 @@
             <w:noProof/>
             <w:webHidden/>
           </w:rPr>
-          <w:t>4</w:t>
+          <w:t>5</w:t>
         </w:r>
         <w:r>
           <w:rPr>
@@ -841,13 +830,13 @@
           <w14:ligatures w14:val="standardContextual"/>
         </w:rPr>
       </w:pPr>
-      <w:hyperlink w:anchor="_Toc227277581" w:history="1">
+      <w:hyperlink w:anchor="_Toc227708702" w:history="1">
         <w:r>
           <w:rPr>
             <w:rStyle w:val="Hyperlink"/>
             <w:noProof/>
           </w:rPr>
-          <w:t>Backend és Adatbázis</w:t>
+          <w:t>Adatbázis</w:t>
         </w:r>
         <w:r>
           <w:rPr>
@@ -868,7 +857,7 @@
             <w:noProof/>
             <w:webHidden/>
           </w:rPr>
-          <w:instrText xml:space="preserve"> PAGEREF _Toc227277581 \h </w:instrText>
+          <w:instrText xml:space="preserve"> PAGEREF _Toc227708702 \h </w:instrText>
         </w:r>
         <w:r>
           <w:rPr>
@@ -888,7 +877,7 @@
             <w:noProof/>
             <w:webHidden/>
           </w:rPr>
-          <w:t>4</w:t>
+          <w:t>5</w:t>
         </w:r>
         <w:r>
           <w:rPr>
@@ -901,7 +890,7 @@
     </w:p>
     <w:p>
       <w:pPr>
-        <w:pStyle w:val="TOC3"/>
+        <w:pStyle w:val="TOC2"/>
         <w:tabs>
           <w:tab w:val="right" w:leader="dot" w:pos="8776"/>
         </w:tabs>
@@ -914,13 +903,13 @@
           <w14:ligatures w14:val="standardContextual"/>
         </w:rPr>
       </w:pPr>
-      <w:hyperlink w:anchor="_Toc227277582" w:history="1">
+      <w:hyperlink w:anchor="_Toc227708703" w:history="1">
         <w:r>
           <w:rPr>
             <w:rStyle w:val="Hyperlink"/>
             <w:noProof/>
           </w:rPr>
-          <w:t>Windows</w:t>
+          <w:t>Backend</w:t>
         </w:r>
         <w:r>
           <w:rPr>
@@ -941,7 +930,7 @@
             <w:noProof/>
             <w:webHidden/>
           </w:rPr>
-          <w:instrText xml:space="preserve"> PAGEREF _Toc227277582 \h </w:instrText>
+          <w:instrText xml:space="preserve"> PAGEREF _Toc227708703 \h </w:instrText>
         </w:r>
         <w:r>
           <w:rPr>
@@ -961,7 +950,7 @@
             <w:noProof/>
             <w:webHidden/>
           </w:rPr>
-          <w:t>4</w:t>
+          <w:t>5</w:t>
         </w:r>
         <w:r>
           <w:rPr>
@@ -974,7 +963,7 @@
     </w:p>
     <w:p>
       <w:pPr>
-        <w:pStyle w:val="TOC3"/>
+        <w:pStyle w:val="TOC2"/>
         <w:tabs>
           <w:tab w:val="right" w:leader="dot" w:pos="8776"/>
         </w:tabs>
@@ -987,13 +976,13 @@
           <w14:ligatures w14:val="standardContextual"/>
         </w:rPr>
       </w:pPr>
-      <w:hyperlink w:anchor="_Toc227277583" w:history="1">
+      <w:hyperlink w:anchor="_Toc227708704" w:history="1">
         <w:r>
           <w:rPr>
             <w:rStyle w:val="Hyperlink"/>
             <w:noProof/>
           </w:rPr>
-          <w:t>MacOS</w:t>
+          <w:t>Frontend</w:t>
         </w:r>
         <w:r>
           <w:rPr>
@@ -1014,7 +1003,7 @@
             <w:noProof/>
             <w:webHidden/>
           </w:rPr>
-          <w:instrText xml:space="preserve"> PAGEREF _Toc227277583 \h </w:instrText>
+          <w:instrText xml:space="preserve"> PAGEREF _Toc227708704 \h </w:instrText>
         </w:r>
         <w:r>
           <w:rPr>
@@ -1034,7 +1023,7 @@
             <w:noProof/>
             <w:webHidden/>
           </w:rPr>
-          <w:t>4</w:t>
+          <w:t>5</w:t>
         </w:r>
         <w:r>
           <w:rPr>
@@ -1047,10 +1036,7 @@
     </w:p>
     <w:p>
       <w:pPr>
-        <w:pStyle w:val="TOC2"/>
-        <w:tabs>
-          <w:tab w:val="right" w:leader="dot" w:pos="8776"/>
-        </w:tabs>
+        <w:pStyle w:val="TOC1"/>
         <w:rPr>
           <w:rFonts w:asciiTheme="minorHAnsi" w:eastAsiaTheme="minorEastAsia" w:hAnsiTheme="minorHAnsi"/>
           <w:noProof/>
@@ -1060,13 +1046,13 @@
           <w14:ligatures w14:val="standardContextual"/>
         </w:rPr>
       </w:pPr>
-      <w:hyperlink w:anchor="_Toc227277584" w:history="1">
+      <w:hyperlink w:anchor="_Toc227708705" w:history="1">
         <w:r>
           <w:rPr>
             <w:rStyle w:val="Hyperlink"/>
             <w:noProof/>
           </w:rPr>
-          <w:t>Kollaboráció</w:t>
+          <w:t>Fejlesztői környezet</w:t>
         </w:r>
         <w:r>
           <w:rPr>
@@ -1087,7 +1073,7 @@
             <w:noProof/>
             <w:webHidden/>
           </w:rPr>
-          <w:instrText xml:space="preserve"> PAGEREF _Toc227277584 \h </w:instrText>
+          <w:instrText xml:space="preserve"> PAGEREF _Toc227708705 \h </w:instrText>
         </w:r>
         <w:r>
           <w:rPr>
@@ -1107,7 +1093,7 @@
             <w:noProof/>
             <w:webHidden/>
           </w:rPr>
-          <w:t>4</w:t>
+          <w:t>6</w:t>
         </w:r>
         <w:r>
           <w:rPr>
@@ -1120,7 +1106,10 @@
     </w:p>
     <w:p>
       <w:pPr>
-        <w:pStyle w:val="TOC1"/>
+        <w:pStyle w:val="TOC2"/>
+        <w:tabs>
+          <w:tab w:val="right" w:leader="dot" w:pos="8776"/>
+        </w:tabs>
         <w:rPr>
           <w:rFonts w:asciiTheme="minorHAnsi" w:eastAsiaTheme="minorEastAsia" w:hAnsiTheme="minorHAnsi"/>
           <w:noProof/>
@@ -1130,13 +1119,13 @@
           <w14:ligatures w14:val="standardContextual"/>
         </w:rPr>
       </w:pPr>
-      <w:hyperlink w:anchor="_Toc227277585" w:history="1">
+      <w:hyperlink w:anchor="_Toc227708706" w:history="1">
         <w:r>
           <w:rPr>
             <w:rStyle w:val="Hyperlink"/>
             <w:noProof/>
           </w:rPr>
-          <w:t>Komponensek technikai leírása</w:t>
+          <w:t>Frontend</w:t>
         </w:r>
         <w:r>
           <w:rPr>
@@ -1157,7 +1146,7 @@
             <w:noProof/>
             <w:webHidden/>
           </w:rPr>
-          <w:instrText xml:space="preserve"> PAGEREF _Toc227277585 \h </w:instrText>
+          <w:instrText xml:space="preserve"> PAGEREF _Toc227708706 \h </w:instrText>
         </w:r>
         <w:r>
           <w:rPr>
@@ -1177,7 +1166,7 @@
             <w:noProof/>
             <w:webHidden/>
           </w:rPr>
-          <w:t>5</w:t>
+          <w:t>6</w:t>
         </w:r>
         <w:r>
           <w:rPr>
@@ -1203,13 +1192,13 @@
           <w14:ligatures w14:val="standardContextual"/>
         </w:rPr>
       </w:pPr>
-      <w:hyperlink w:anchor="_Toc227277586" w:history="1">
+      <w:hyperlink w:anchor="_Toc227708707" w:history="1">
         <w:r>
           <w:rPr>
             <w:rStyle w:val="Hyperlink"/>
             <w:noProof/>
           </w:rPr>
-          <w:t>Adatbázis</w:t>
+          <w:t>Backend és Adatbázis</w:t>
         </w:r>
         <w:r>
           <w:rPr>
@@ -1230,7 +1219,7 @@
             <w:noProof/>
             <w:webHidden/>
           </w:rPr>
-          <w:instrText xml:space="preserve"> PAGEREF _Toc227277586 \h </w:instrText>
+          <w:instrText xml:space="preserve"> PAGEREF _Toc227708707 \h </w:instrText>
         </w:r>
         <w:r>
           <w:rPr>
@@ -1250,7 +1239,7 @@
             <w:noProof/>
             <w:webHidden/>
           </w:rPr>
-          <w:t>5</w:t>
+          <w:t>6</w:t>
         </w:r>
         <w:r>
           <w:rPr>
@@ -1276,13 +1265,13 @@
           <w14:ligatures w14:val="standardContextual"/>
         </w:rPr>
       </w:pPr>
-      <w:hyperlink w:anchor="_Toc227277587" w:history="1">
+      <w:hyperlink w:anchor="_Toc227708708" w:history="1">
         <w:r>
           <w:rPr>
             <w:rStyle w:val="Hyperlink"/>
             <w:noProof/>
           </w:rPr>
-          <w:t>Egyedtípusok</w:t>
+          <w:t>Windows</w:t>
         </w:r>
         <w:r>
           <w:rPr>
@@ -1303,7 +1292,7 @@
             <w:noProof/>
             <w:webHidden/>
           </w:rPr>
-          <w:instrText xml:space="preserve"> PAGEREF _Toc227277587 \h </w:instrText>
+          <w:instrText xml:space="preserve"> PAGEREF _Toc227708708 \h </w:instrText>
         </w:r>
         <w:r>
           <w:rPr>
@@ -1323,7 +1312,7 @@
             <w:noProof/>
             <w:webHidden/>
           </w:rPr>
-          <w:t>5</w:t>
+          <w:t>6</w:t>
         </w:r>
         <w:r>
           <w:rPr>
@@ -1336,7 +1325,7 @@
     </w:p>
     <w:p>
       <w:pPr>
-        <w:pStyle w:val="TOC4"/>
+        <w:pStyle w:val="TOC3"/>
         <w:tabs>
           <w:tab w:val="right" w:leader="dot" w:pos="8776"/>
         </w:tabs>
@@ -1349,13 +1338,13 @@
           <w14:ligatures w14:val="standardContextual"/>
         </w:rPr>
       </w:pPr>
-      <w:hyperlink w:anchor="_Toc227277588" w:history="1">
+      <w:hyperlink w:anchor="_Toc227708709" w:history="1">
         <w:r>
           <w:rPr>
             <w:rStyle w:val="Hyperlink"/>
             <w:noProof/>
           </w:rPr>
-          <w:t>Felhasználó (users)</w:t>
+          <w:t>MacOS</w:t>
         </w:r>
         <w:r>
           <w:rPr>
@@ -1376,7 +1365,7 @@
             <w:noProof/>
             <w:webHidden/>
           </w:rPr>
-          <w:instrText xml:space="preserve"> PAGEREF _Toc227277588 \h </w:instrText>
+          <w:instrText xml:space="preserve"> PAGEREF _Toc227708709 \h </w:instrText>
         </w:r>
         <w:r>
           <w:rPr>
@@ -1396,7 +1385,7 @@
             <w:noProof/>
             <w:webHidden/>
           </w:rPr>
-          <w:t>5</w:t>
+          <w:t>6</w:t>
         </w:r>
         <w:r>
           <w:rPr>
@@ -1409,7 +1398,7 @@
     </w:p>
     <w:p>
       <w:pPr>
-        <w:pStyle w:val="TOC4"/>
+        <w:pStyle w:val="TOC2"/>
         <w:tabs>
           <w:tab w:val="right" w:leader="dot" w:pos="8776"/>
         </w:tabs>
@@ -1422,13 +1411,13 @@
           <w14:ligatures w14:val="standardContextual"/>
         </w:rPr>
       </w:pPr>
-      <w:hyperlink w:anchor="_Toc227277589" w:history="1">
+      <w:hyperlink w:anchor="_Toc227708710" w:history="1">
         <w:r>
           <w:rPr>
             <w:rStyle w:val="Hyperlink"/>
             <w:noProof/>
           </w:rPr>
-          <w:t>Token (usertokens)</w:t>
+          <w:t>Kollaboráció</w:t>
         </w:r>
         <w:r>
           <w:rPr>
@@ -1449,7 +1438,7 @@
             <w:noProof/>
             <w:webHidden/>
           </w:rPr>
-          <w:instrText xml:space="preserve"> PAGEREF _Toc227277589 \h </w:instrText>
+          <w:instrText xml:space="preserve"> PAGEREF _Toc227708710 \h </w:instrText>
         </w:r>
         <w:r>
           <w:rPr>
@@ -1469,7 +1458,7 @@
             <w:noProof/>
             <w:webHidden/>
           </w:rPr>
-          <w:t>7</w:t>
+          <w:t>6</w:t>
         </w:r>
         <w:r>
           <w:rPr>
@@ -1482,10 +1471,7 @@
     </w:p>
     <w:p>
       <w:pPr>
-        <w:pStyle w:val="TOC4"/>
-        <w:tabs>
-          <w:tab w:val="right" w:leader="dot" w:pos="8776"/>
-        </w:tabs>
+        <w:pStyle w:val="TOC1"/>
         <w:rPr>
           <w:rFonts w:asciiTheme="minorHAnsi" w:eastAsiaTheme="minorEastAsia" w:hAnsiTheme="minorHAnsi"/>
           <w:noProof/>
@@ -1495,13 +1481,13 @@
           <w14:ligatures w14:val="standardContextual"/>
         </w:rPr>
       </w:pPr>
-      <w:hyperlink w:anchor="_Toc227277590" w:history="1">
+      <w:hyperlink w:anchor="_Toc227708711" w:history="1">
         <w:r>
           <w:rPr>
             <w:rStyle w:val="Hyperlink"/>
             <w:noProof/>
           </w:rPr>
-          <w:t>Értesítés (notifications)</w:t>
+          <w:t>Komponensek technikai leírása</w:t>
         </w:r>
         <w:r>
           <w:rPr>
@@ -1522,7 +1508,7 @@
             <w:noProof/>
             <w:webHidden/>
           </w:rPr>
-          <w:instrText xml:space="preserve"> PAGEREF _Toc227277590 \h </w:instrText>
+          <w:instrText xml:space="preserve"> PAGEREF _Toc227708711 \h </w:instrText>
         </w:r>
         <w:r>
           <w:rPr>
@@ -1555,7 +1541,7 @@
     </w:p>
     <w:p>
       <w:pPr>
-        <w:pStyle w:val="TOC4"/>
+        <w:pStyle w:val="TOC2"/>
         <w:tabs>
           <w:tab w:val="right" w:leader="dot" w:pos="8776"/>
         </w:tabs>
@@ -1568,13 +1554,13 @@
           <w14:ligatures w14:val="standardContextual"/>
         </w:rPr>
       </w:pPr>
-      <w:hyperlink w:anchor="_Toc227277591" w:history="1">
+      <w:hyperlink w:anchor="_Toc227708712" w:history="1">
         <w:r>
           <w:rPr>
             <w:rStyle w:val="Hyperlink"/>
             <w:noProof/>
           </w:rPr>
-          <w:t>Jármű (vehicles)</w:t>
+          <w:t>Adatbázis</w:t>
         </w:r>
         <w:r>
           <w:rPr>
@@ -1595,7 +1581,7 @@
             <w:noProof/>
             <w:webHidden/>
           </w:rPr>
-          <w:instrText xml:space="preserve"> PAGEREF _Toc227277591 \h </w:instrText>
+          <w:instrText xml:space="preserve"> PAGEREF _Toc227708712 \h </w:instrText>
         </w:r>
         <w:r>
           <w:rPr>
@@ -1615,7 +1601,7 @@
             <w:noProof/>
             <w:webHidden/>
           </w:rPr>
-          <w:t>8</w:t>
+          <w:t>7</w:t>
         </w:r>
         <w:r>
           <w:rPr>
@@ -1628,7 +1614,7 @@
     </w:p>
     <w:p>
       <w:pPr>
-        <w:pStyle w:val="TOC4"/>
+        <w:pStyle w:val="TOC3"/>
         <w:tabs>
           <w:tab w:val="right" w:leader="dot" w:pos="8776"/>
         </w:tabs>
@@ -1641,13 +1627,13 @@
           <w14:ligatures w14:val="standardContextual"/>
         </w:rPr>
       </w:pPr>
-      <w:hyperlink w:anchor="_Toc227277592" w:history="1">
+      <w:hyperlink w:anchor="_Toc227708713" w:history="1">
         <w:r>
           <w:rPr>
             <w:rStyle w:val="Hyperlink"/>
             <w:noProof/>
           </w:rPr>
-          <w:t>Járműelérhetőség (vehicleavailabilities)</w:t>
+          <w:t>Egyedtípusok</w:t>
         </w:r>
         <w:r>
           <w:rPr>
@@ -1668,7 +1654,7 @@
             <w:noProof/>
             <w:webHidden/>
           </w:rPr>
-          <w:instrText xml:space="preserve"> PAGEREF _Toc227277592 \h </w:instrText>
+          <w:instrText xml:space="preserve"> PAGEREF _Toc227708713 \h </w:instrText>
         </w:r>
         <w:r>
           <w:rPr>
@@ -1688,7 +1674,7 @@
             <w:noProof/>
             <w:webHidden/>
           </w:rPr>
-          <w:t>9</w:t>
+          <w:t>7</w:t>
         </w:r>
         <w:r>
           <w:rPr>
@@ -1714,13 +1700,13 @@
           <w14:ligatures w14:val="standardContextual"/>
         </w:rPr>
       </w:pPr>
-      <w:hyperlink w:anchor="_Toc227277593" w:history="1">
+      <w:hyperlink w:anchor="_Toc227708714" w:history="1">
         <w:r>
           <w:rPr>
             <w:rStyle w:val="Hyperlink"/>
             <w:noProof/>
           </w:rPr>
-          <w:t>Járműkép (vehicleimages)</w:t>
+          <w:t>Felhasználó (users)</w:t>
         </w:r>
         <w:r>
           <w:rPr>
@@ -1741,7 +1727,7 @@
             <w:noProof/>
             <w:webHidden/>
           </w:rPr>
-          <w:instrText xml:space="preserve"> PAGEREF _Toc227277593 \h </w:instrText>
+          <w:instrText xml:space="preserve"> PAGEREF _Toc227708714 \h </w:instrText>
         </w:r>
         <w:r>
           <w:rPr>
@@ -1761,7 +1747,7 @@
             <w:noProof/>
             <w:webHidden/>
           </w:rPr>
-          <w:t>9</w:t>
+          <w:t>7</w:t>
         </w:r>
         <w:r>
           <w:rPr>
@@ -1787,13 +1773,13 @@
           <w14:ligatures w14:val="standardContextual"/>
         </w:rPr>
       </w:pPr>
-      <w:hyperlink w:anchor="_Toc227277594" w:history="1">
+      <w:hyperlink w:anchor="_Toc227708715" w:history="1">
         <w:r>
           <w:rPr>
             <w:rStyle w:val="Hyperlink"/>
             <w:noProof/>
           </w:rPr>
-          <w:t>Bérlés (rentals)</w:t>
+          <w:t>Token (usertokens)</w:t>
         </w:r>
         <w:r>
           <w:rPr>
@@ -1814,7 +1800,7 @@
             <w:noProof/>
             <w:webHidden/>
           </w:rPr>
-          <w:instrText xml:space="preserve"> PAGEREF _Toc227277594 \h </w:instrText>
+          <w:instrText xml:space="preserve"> PAGEREF _Toc227708715 \h </w:instrText>
         </w:r>
         <w:r>
           <w:rPr>
@@ -1834,7 +1820,7 @@
             <w:noProof/>
             <w:webHidden/>
           </w:rPr>
-          <w:t>10</w:t>
+          <w:t>9</w:t>
         </w:r>
         <w:r>
           <w:rPr>
@@ -1860,13 +1846,13 @@
           <w14:ligatures w14:val="standardContextual"/>
         </w:rPr>
       </w:pPr>
-      <w:hyperlink w:anchor="_Toc227277595" w:history="1">
+      <w:hyperlink w:anchor="_Toc227708716" w:history="1">
         <w:r>
           <w:rPr>
             <w:rStyle w:val="Hyperlink"/>
             <w:noProof/>
           </w:rPr>
-          <w:t>Üzenet (messages)</w:t>
+          <w:t>Értesítés (notifications)</w:t>
         </w:r>
         <w:r>
           <w:rPr>
@@ -1887,7 +1873,7 @@
             <w:noProof/>
             <w:webHidden/>
           </w:rPr>
-          <w:instrText xml:space="preserve"> PAGEREF _Toc227277595 \h </w:instrText>
+          <w:instrText xml:space="preserve"> PAGEREF _Toc227708716 \h </w:instrText>
         </w:r>
         <w:r>
           <w:rPr>
@@ -1907,7 +1893,7 @@
             <w:noProof/>
             <w:webHidden/>
           </w:rPr>
-          <w:t>11</w:t>
+          <w:t>9</w:t>
         </w:r>
         <w:r>
           <w:rPr>
@@ -1920,7 +1906,7 @@
     </w:p>
     <w:p>
       <w:pPr>
-        <w:pStyle w:val="TOC3"/>
+        <w:pStyle w:val="TOC4"/>
         <w:tabs>
           <w:tab w:val="right" w:leader="dot" w:pos="8776"/>
         </w:tabs>
@@ -1933,13 +1919,13 @@
           <w14:ligatures w14:val="standardContextual"/>
         </w:rPr>
       </w:pPr>
-      <w:hyperlink w:anchor="_Toc227277596" w:history="1">
+      <w:hyperlink w:anchor="_Toc227708717" w:history="1">
         <w:r>
           <w:rPr>
             <w:rStyle w:val="Hyperlink"/>
             <w:noProof/>
           </w:rPr>
-          <w:t>Kapcsolatok</w:t>
+          <w:t>Jármű (vehicles)</w:t>
         </w:r>
         <w:r>
           <w:rPr>
@@ -1960,7 +1946,7 @@
             <w:noProof/>
             <w:webHidden/>
           </w:rPr>
-          <w:instrText xml:space="preserve"> PAGEREF _Toc227277596 \h </w:instrText>
+          <w:instrText xml:space="preserve"> PAGEREF _Toc227708717 \h </w:instrText>
         </w:r>
         <w:r>
           <w:rPr>
@@ -1980,7 +1966,7 @@
             <w:noProof/>
             <w:webHidden/>
           </w:rPr>
-          <w:t>12</w:t>
+          <w:t>10</w:t>
         </w:r>
         <w:r>
           <w:rPr>
@@ -1993,7 +1979,7 @@
     </w:p>
     <w:p>
       <w:pPr>
-        <w:pStyle w:val="TOC3"/>
+        <w:pStyle w:val="TOC4"/>
         <w:tabs>
           <w:tab w:val="right" w:leader="dot" w:pos="8776"/>
         </w:tabs>
@@ -2006,13 +1992,13 @@
           <w14:ligatures w14:val="standardContextual"/>
         </w:rPr>
       </w:pPr>
-      <w:hyperlink w:anchor="_Toc227277597" w:history="1">
+      <w:hyperlink w:anchor="_Toc227708718" w:history="1">
         <w:r>
           <w:rPr>
             <w:rStyle w:val="Hyperlink"/>
             <w:noProof/>
           </w:rPr>
-          <w:t>Implementáció</w:t>
+          <w:t>Járműelérhetőség (vehicleavailabilities)</w:t>
         </w:r>
         <w:r>
           <w:rPr>
@@ -2033,7 +2019,7 @@
             <w:noProof/>
             <w:webHidden/>
           </w:rPr>
-          <w:instrText xml:space="preserve"> PAGEREF _Toc227277597 \h </w:instrText>
+          <w:instrText xml:space="preserve"> PAGEREF _Toc227708718 \h </w:instrText>
         </w:r>
         <w:r>
           <w:rPr>
@@ -2053,7 +2039,7 @@
             <w:noProof/>
             <w:webHidden/>
           </w:rPr>
-          <w:t>13</w:t>
+          <w:t>11</w:t>
         </w:r>
         <w:r>
           <w:rPr>
@@ -2066,7 +2052,7 @@
     </w:p>
     <w:p>
       <w:pPr>
-        <w:pStyle w:val="TOC2"/>
+        <w:pStyle w:val="TOC4"/>
         <w:tabs>
           <w:tab w:val="right" w:leader="dot" w:pos="8776"/>
         </w:tabs>
@@ -2079,13 +2065,13 @@
           <w14:ligatures w14:val="standardContextual"/>
         </w:rPr>
       </w:pPr>
-      <w:hyperlink w:anchor="_Toc227277598" w:history="1">
+      <w:hyperlink w:anchor="_Toc227708719" w:history="1">
         <w:r>
           <w:rPr>
             <w:rStyle w:val="Hyperlink"/>
             <w:noProof/>
           </w:rPr>
-          <w:t>Backend</w:t>
+          <w:t>Járműkép (vehicleimages)</w:t>
         </w:r>
         <w:r>
           <w:rPr>
@@ -2106,7 +2092,7 @@
             <w:noProof/>
             <w:webHidden/>
           </w:rPr>
-          <w:instrText xml:space="preserve"> PAGEREF _Toc227277598 \h </w:instrText>
+          <w:instrText xml:space="preserve"> PAGEREF _Toc227708719 \h </w:instrText>
         </w:r>
         <w:r>
           <w:rPr>
@@ -2126,7 +2112,7 @@
             <w:noProof/>
             <w:webHidden/>
           </w:rPr>
-          <w:t>14</w:t>
+          <w:t>11</w:t>
         </w:r>
         <w:r>
           <w:rPr>
@@ -2139,7 +2125,7 @@
     </w:p>
     <w:p>
       <w:pPr>
-        <w:pStyle w:val="TOC3"/>
+        <w:pStyle w:val="TOC4"/>
         <w:tabs>
           <w:tab w:val="right" w:leader="dot" w:pos="8776"/>
         </w:tabs>
@@ -2152,13 +2138,13 @@
           <w14:ligatures w14:val="standardContextual"/>
         </w:rPr>
       </w:pPr>
-      <w:hyperlink w:anchor="_Toc227277599" w:history="1">
+      <w:hyperlink w:anchor="_Toc227708720" w:history="1">
         <w:r>
           <w:rPr>
             <w:rStyle w:val="Hyperlink"/>
             <w:noProof/>
           </w:rPr>
-          <w:t>Metóduskontrollerek</w:t>
+          <w:t>Bérlés (rentals)</w:t>
         </w:r>
         <w:r>
           <w:rPr>
@@ -2179,7 +2165,7 @@
             <w:noProof/>
             <w:webHidden/>
           </w:rPr>
-          <w:instrText xml:space="preserve"> PAGEREF _Toc227277599 \h </w:instrText>
+          <w:instrText xml:space="preserve"> PAGEREF _Toc227708720 \h </w:instrText>
         </w:r>
         <w:r>
           <w:rPr>
@@ -2199,7 +2185,7 @@
             <w:noProof/>
             <w:webHidden/>
           </w:rPr>
-          <w:t>14</w:t>
+          <w:t>12</w:t>
         </w:r>
         <w:r>
           <w:rPr>
@@ -2225,13 +2211,13 @@
           <w14:ligatures w14:val="standardContextual"/>
         </w:rPr>
       </w:pPr>
-      <w:hyperlink w:anchor="_Toc227277600" w:history="1">
+      <w:hyperlink w:anchor="_Toc227708721" w:history="1">
         <w:r>
           <w:rPr>
             <w:rStyle w:val="Hyperlink"/>
             <w:noProof/>
           </w:rPr>
-          <w:t>Autentikációs kontroller – AuthController</w:t>
+          <w:t>Üzenet (messages)</w:t>
         </w:r>
         <w:r>
           <w:rPr>
@@ -2252,7 +2238,7 @@
             <w:noProof/>
             <w:webHidden/>
           </w:rPr>
-          <w:instrText xml:space="preserve"> PAGEREF _Toc227277600 \h </w:instrText>
+          <w:instrText xml:space="preserve"> PAGEREF _Toc227708721 \h </w:instrText>
         </w:r>
         <w:r>
           <w:rPr>
@@ -2272,7 +2258,7 @@
             <w:noProof/>
             <w:webHidden/>
           </w:rPr>
-          <w:t>14</w:t>
+          <w:t>13</w:t>
         </w:r>
         <w:r>
           <w:rPr>
@@ -2285,7 +2271,7 @@
     </w:p>
     <w:p>
       <w:pPr>
-        <w:pStyle w:val="TOC4"/>
+        <w:pStyle w:val="TOC3"/>
         <w:tabs>
           <w:tab w:val="right" w:leader="dot" w:pos="8776"/>
         </w:tabs>
@@ -2298,13 +2284,13 @@
           <w14:ligatures w14:val="standardContextual"/>
         </w:rPr>
       </w:pPr>
-      <w:hyperlink w:anchor="_Toc227277601" w:history="1">
+      <w:hyperlink w:anchor="_Toc227708722" w:history="1">
         <w:r>
           <w:rPr>
             <w:rStyle w:val="Hyperlink"/>
             <w:noProof/>
           </w:rPr>
-          <w:t>Felhasználó kontroller – UserController</w:t>
+          <w:t>Kapcsolatok</w:t>
         </w:r>
         <w:r>
           <w:rPr>
@@ -2325,7 +2311,7 @@
             <w:noProof/>
             <w:webHidden/>
           </w:rPr>
-          <w:instrText xml:space="preserve"> PAGEREF _Toc227277601 \h </w:instrText>
+          <w:instrText xml:space="preserve"> PAGEREF _Toc227708722 \h </w:instrText>
         </w:r>
         <w:r>
           <w:rPr>
@@ -2345,7 +2331,7 @@
             <w:noProof/>
             <w:webHidden/>
           </w:rPr>
-          <w:t>17</w:t>
+          <w:t>14</w:t>
         </w:r>
         <w:r>
           <w:rPr>
@@ -2358,7 +2344,7 @@
     </w:p>
     <w:p>
       <w:pPr>
-        <w:pStyle w:val="TOC4"/>
+        <w:pStyle w:val="TOC3"/>
         <w:tabs>
           <w:tab w:val="right" w:leader="dot" w:pos="8776"/>
         </w:tabs>
@@ -2371,13 +2357,13 @@
           <w14:ligatures w14:val="standardContextual"/>
         </w:rPr>
       </w:pPr>
-      <w:hyperlink w:anchor="_Toc227277602" w:history="1">
+      <w:hyperlink w:anchor="_Toc227708723" w:history="1">
         <w:r>
           <w:rPr>
             <w:rStyle w:val="Hyperlink"/>
             <w:noProof/>
           </w:rPr>
-          <w:t>Bérlés kontroller – RentalController</w:t>
+          <w:t>Implementáció</w:t>
         </w:r>
         <w:r>
           <w:rPr>
@@ -2398,7 +2384,7 @@
             <w:noProof/>
             <w:webHidden/>
           </w:rPr>
-          <w:instrText xml:space="preserve"> PAGEREF _Toc227277602 \h </w:instrText>
+          <w:instrText xml:space="preserve"> PAGEREF _Toc227708723 \h </w:instrText>
         </w:r>
         <w:r>
           <w:rPr>
@@ -2418,7 +2404,7 @@
             <w:noProof/>
             <w:webHidden/>
           </w:rPr>
-          <w:t>21</w:t>
+          <w:t>15</w:t>
         </w:r>
         <w:r>
           <w:rPr>
@@ -2431,7 +2417,7 @@
     </w:p>
     <w:p>
       <w:pPr>
-        <w:pStyle w:val="TOC4"/>
+        <w:pStyle w:val="TOC2"/>
         <w:tabs>
           <w:tab w:val="right" w:leader="dot" w:pos="8776"/>
         </w:tabs>
@@ -2444,13 +2430,13 @@
           <w14:ligatures w14:val="standardContextual"/>
         </w:rPr>
       </w:pPr>
-      <w:hyperlink w:anchor="_Toc227277603" w:history="1">
+      <w:hyperlink w:anchor="_Toc227708724" w:history="1">
         <w:r>
           <w:rPr>
             <w:rStyle w:val="Hyperlink"/>
             <w:noProof/>
           </w:rPr>
-          <w:t>Jármű kontroller – VehicleController</w:t>
+          <w:t>Backend</w:t>
         </w:r>
         <w:r>
           <w:rPr>
@@ -2471,7 +2457,7 @@
             <w:noProof/>
             <w:webHidden/>
           </w:rPr>
-          <w:instrText xml:space="preserve"> PAGEREF _Toc227277603 \h </w:instrText>
+          <w:instrText xml:space="preserve"> PAGEREF _Toc227708724 \h </w:instrText>
         </w:r>
         <w:r>
           <w:rPr>
@@ -2491,7 +2477,7 @@
             <w:noProof/>
             <w:webHidden/>
           </w:rPr>
-          <w:t>25</w:t>
+          <w:t>16</w:t>
         </w:r>
         <w:r>
           <w:rPr>
@@ -2517,13 +2503,13 @@
           <w14:ligatures w14:val="standardContextual"/>
         </w:rPr>
       </w:pPr>
-      <w:hyperlink w:anchor="_Toc227277604" w:history="1">
+      <w:hyperlink w:anchor="_Toc227708725" w:history="1">
         <w:r>
           <w:rPr>
             <w:rStyle w:val="Hyperlink"/>
             <w:noProof/>
           </w:rPr>
-          <w:t>Szolgáltatások</w:t>
+          <w:t>Metóduskontrollerek</w:t>
         </w:r>
         <w:r>
           <w:rPr>
@@ -2544,7 +2530,7 @@
             <w:noProof/>
             <w:webHidden/>
           </w:rPr>
-          <w:instrText xml:space="preserve"> PAGEREF _Toc227277604 \h </w:instrText>
+          <w:instrText xml:space="preserve"> PAGEREF _Toc227708725 \h </w:instrText>
         </w:r>
         <w:r>
           <w:rPr>
@@ -2564,7 +2550,7 @@
             <w:noProof/>
             <w:webHidden/>
           </w:rPr>
-          <w:t>34</w:t>
+          <w:t>16</w:t>
         </w:r>
         <w:r>
           <w:rPr>
@@ -2590,13 +2576,13 @@
           <w14:ligatures w14:val="standardContextual"/>
         </w:rPr>
       </w:pPr>
-      <w:hyperlink w:anchor="_Toc227277605" w:history="1">
+      <w:hyperlink w:anchor="_Toc227708726" w:history="1">
         <w:r>
           <w:rPr>
             <w:rStyle w:val="Hyperlink"/>
             <w:noProof/>
           </w:rPr>
-          <w:t>Autentikációs szolgáltatás – AuthService</w:t>
+          <w:t>Autentikációs kontroller – AuthController</w:t>
         </w:r>
         <w:r>
           <w:rPr>
@@ -2617,7 +2603,7 @@
             <w:noProof/>
             <w:webHidden/>
           </w:rPr>
-          <w:instrText xml:space="preserve"> PAGEREF _Toc227277605 \h </w:instrText>
+          <w:instrText xml:space="preserve"> PAGEREF _Toc227708726 \h </w:instrText>
         </w:r>
         <w:r>
           <w:rPr>
@@ -2637,7 +2623,7 @@
             <w:noProof/>
             <w:webHidden/>
           </w:rPr>
-          <w:t>34</w:t>
+          <w:t>16</w:t>
         </w:r>
         <w:r>
           <w:rPr>
@@ -2663,13 +2649,13 @@
           <w14:ligatures w14:val="standardContextual"/>
         </w:rPr>
       </w:pPr>
-      <w:hyperlink w:anchor="_Toc227277606" w:history="1">
+      <w:hyperlink w:anchor="_Toc227708727" w:history="1">
         <w:r>
           <w:rPr>
             <w:rStyle w:val="Hyperlink"/>
             <w:noProof/>
           </w:rPr>
-          <w:t>Email szolgáltatás – IEmailService – ResendEmailService</w:t>
+          <w:t>Felhasználó kontroller – UserController</w:t>
         </w:r>
         <w:r>
           <w:rPr>
@@ -2690,7 +2676,7 @@
             <w:noProof/>
             <w:webHidden/>
           </w:rPr>
-          <w:instrText xml:space="preserve"> PAGEREF _Toc227277606 \h </w:instrText>
+          <w:instrText xml:space="preserve"> PAGEREF _Toc227708727 \h </w:instrText>
         </w:r>
         <w:r>
           <w:rPr>
@@ -2710,7 +2696,7 @@
             <w:noProof/>
             <w:webHidden/>
           </w:rPr>
-          <w:t>35</w:t>
+          <w:t>19</w:t>
         </w:r>
         <w:r>
           <w:rPr>
@@ -2736,13 +2722,13 @@
           <w14:ligatures w14:val="standardContextual"/>
         </w:rPr>
       </w:pPr>
-      <w:hyperlink w:anchor="_Toc227277607" w:history="1">
+      <w:hyperlink w:anchor="_Toc227708728" w:history="1">
         <w:r>
           <w:rPr>
             <w:rStyle w:val="Hyperlink"/>
             <w:noProof/>
           </w:rPr>
-          <w:t>Képerőforrás-kezelő szolgáltatás – IResourceService – LocalResourceService</w:t>
+          <w:t>Bérlés kontroller – RentalController</w:t>
         </w:r>
         <w:r>
           <w:rPr>
@@ -2763,7 +2749,7 @@
             <w:noProof/>
             <w:webHidden/>
           </w:rPr>
-          <w:instrText xml:space="preserve"> PAGEREF _Toc227277607 \h </w:instrText>
+          <w:instrText xml:space="preserve"> PAGEREF _Toc227708728 \h </w:instrText>
         </w:r>
         <w:r>
           <w:rPr>
@@ -2783,7 +2769,7 @@
             <w:noProof/>
             <w:webHidden/>
           </w:rPr>
-          <w:t>35</w:t>
+          <w:t>23</w:t>
         </w:r>
         <w:r>
           <w:rPr>
@@ -2809,13 +2795,13 @@
           <w14:ligatures w14:val="standardContextual"/>
         </w:rPr>
       </w:pPr>
-      <w:hyperlink w:anchor="_Toc227277608" w:history="1">
+      <w:hyperlink w:anchor="_Toc227708729" w:history="1">
         <w:r>
           <w:rPr>
             <w:rStyle w:val="Hyperlink"/>
             <w:noProof/>
           </w:rPr>
-          <w:t>Bérléskezelő szolgáltatás – RentalService</w:t>
+          <w:t>Jármű kontroller – VehicleController</w:t>
         </w:r>
         <w:r>
           <w:rPr>
@@ -2836,7 +2822,7 @@
             <w:noProof/>
             <w:webHidden/>
           </w:rPr>
-          <w:instrText xml:space="preserve"> PAGEREF _Toc227277608 \h </w:instrText>
+          <w:instrText xml:space="preserve"> PAGEREF _Toc227708729 \h </w:instrText>
         </w:r>
         <w:r>
           <w:rPr>
@@ -2856,7 +2842,7 @@
             <w:noProof/>
             <w:webHidden/>
           </w:rPr>
-          <w:t>36</w:t>
+          <w:t>27</w:t>
         </w:r>
         <w:r>
           <w:rPr>
@@ -2882,13 +2868,13 @@
           <w14:ligatures w14:val="standardContextual"/>
         </w:rPr>
       </w:pPr>
-      <w:hyperlink w:anchor="_Toc227277609" w:history="1">
+      <w:hyperlink w:anchor="_Toc227708730" w:history="1">
         <w:r>
           <w:rPr>
             <w:rStyle w:val="Hyperlink"/>
             <w:noProof/>
           </w:rPr>
-          <w:t>Válaszszűrőrendszer – VisibilityFiltering</w:t>
+          <w:t>Szolgáltatások</w:t>
         </w:r>
         <w:r>
           <w:rPr>
@@ -2909,7 +2895,7 @@
             <w:noProof/>
             <w:webHidden/>
           </w:rPr>
-          <w:instrText xml:space="preserve"> PAGEREF _Toc227277609 \h </w:instrText>
+          <w:instrText xml:space="preserve"> PAGEREF _Toc227708730 \h </w:instrText>
         </w:r>
         <w:r>
           <w:rPr>
@@ -2929,7 +2915,7 @@
             <w:noProof/>
             <w:webHidden/>
           </w:rPr>
-          <w:t>38</w:t>
+          <w:t>36</w:t>
         </w:r>
         <w:r>
           <w:rPr>
@@ -2942,7 +2928,10 @@
     </w:p>
     <w:p>
       <w:pPr>
-        <w:pStyle w:val="TOC1"/>
+        <w:pStyle w:val="TOC4"/>
+        <w:tabs>
+          <w:tab w:val="right" w:leader="dot" w:pos="8776"/>
+        </w:tabs>
         <w:rPr>
           <w:rFonts w:asciiTheme="minorHAnsi" w:eastAsiaTheme="minorEastAsia" w:hAnsiTheme="minorHAnsi"/>
           <w:noProof/>
@@ -2952,13 +2941,13 @@
           <w14:ligatures w14:val="standardContextual"/>
         </w:rPr>
       </w:pPr>
-      <w:hyperlink w:anchor="_Toc227277610" w:history="1">
+      <w:hyperlink w:anchor="_Toc227708731" w:history="1">
         <w:r>
           <w:rPr>
             <w:rStyle w:val="Hyperlink"/>
             <w:noProof/>
           </w:rPr>
-          <w:t>Működésének műszaki feltételei</w:t>
+          <w:t>Autentikációs szolgáltatás – AuthService</w:t>
         </w:r>
         <w:r>
           <w:rPr>
@@ -2979,7 +2968,7 @@
             <w:noProof/>
             <w:webHidden/>
           </w:rPr>
-          <w:instrText xml:space="preserve"> PAGEREF _Toc227277610 \h </w:instrText>
+          <w:instrText xml:space="preserve"> PAGEREF _Toc227708731 \h </w:instrText>
         </w:r>
         <w:r>
           <w:rPr>
@@ -2999,7 +2988,7 @@
             <w:noProof/>
             <w:webHidden/>
           </w:rPr>
-          <w:t>39</w:t>
+          <w:t>36</w:t>
         </w:r>
         <w:r>
           <w:rPr>
@@ -3012,7 +3001,10 @@
     </w:p>
     <w:p>
       <w:pPr>
-        <w:pStyle w:val="TOC1"/>
+        <w:pStyle w:val="TOC4"/>
+        <w:tabs>
+          <w:tab w:val="right" w:leader="dot" w:pos="8776"/>
+        </w:tabs>
         <w:rPr>
           <w:rFonts w:asciiTheme="minorHAnsi" w:eastAsiaTheme="minorEastAsia" w:hAnsiTheme="minorHAnsi"/>
           <w:noProof/>
@@ -3022,13 +3014,13 @@
           <w14:ligatures w14:val="standardContextual"/>
         </w:rPr>
       </w:pPr>
-      <w:hyperlink w:anchor="_Toc227277611" w:history="1">
+      <w:hyperlink w:anchor="_Toc227708732" w:history="1">
         <w:r>
           <w:rPr>
             <w:rStyle w:val="Hyperlink"/>
             <w:noProof/>
           </w:rPr>
-          <w:t>Használatának rövid bemutatása</w:t>
+          <w:t>Email szolgáltatás – IEmailService – ResendEmailService</w:t>
         </w:r>
         <w:r>
           <w:rPr>
@@ -3049,7 +3041,7 @@
             <w:noProof/>
             <w:webHidden/>
           </w:rPr>
-          <w:instrText xml:space="preserve"> PAGEREF _Toc227277611 \h </w:instrText>
+          <w:instrText xml:space="preserve"> PAGEREF _Toc227708732 \h </w:instrText>
         </w:r>
         <w:r>
           <w:rPr>
@@ -3069,7 +3061,7 @@
             <w:noProof/>
             <w:webHidden/>
           </w:rPr>
-          <w:t>40</w:t>
+          <w:t>37</w:t>
         </w:r>
         <w:r>
           <w:rPr>
@@ -3082,7 +3074,10 @@
     </w:p>
     <w:p>
       <w:pPr>
-        <w:pStyle w:val="TOC1"/>
+        <w:pStyle w:val="TOC4"/>
+        <w:tabs>
+          <w:tab w:val="right" w:leader="dot" w:pos="8776"/>
+        </w:tabs>
         <w:rPr>
           <w:rFonts w:asciiTheme="minorHAnsi" w:eastAsiaTheme="minorEastAsia" w:hAnsiTheme="minorHAnsi"/>
           <w:noProof/>
@@ -3092,13 +3087,13 @@
           <w14:ligatures w14:val="standardContextual"/>
         </w:rPr>
       </w:pPr>
-      <w:hyperlink w:anchor="_Toc227277612" w:history="1">
+      <w:hyperlink w:anchor="_Toc227708733" w:history="1">
         <w:r>
           <w:rPr>
             <w:rStyle w:val="Hyperlink"/>
             <w:noProof/>
           </w:rPr>
-          <w:t>Továbbfejlesztési lehetőségek</w:t>
+          <w:t>Képerőforrás-kezelő szolgáltatás – IResourceService – LocalResourceService</w:t>
         </w:r>
         <w:r>
           <w:rPr>
@@ -3119,7 +3114,7 @@
             <w:noProof/>
             <w:webHidden/>
           </w:rPr>
-          <w:instrText xml:space="preserve"> PAGEREF _Toc227277612 \h </w:instrText>
+          <w:instrText xml:space="preserve"> PAGEREF _Toc227708733 \h </w:instrText>
         </w:r>
         <w:r>
           <w:rPr>
@@ -3139,7 +3134,7 @@
             <w:noProof/>
             <w:webHidden/>
           </w:rPr>
-          <w:t>41</w:t>
+          <w:t>37</w:t>
         </w:r>
         <w:r>
           <w:rPr>
@@ -3152,7 +3147,10 @@
     </w:p>
     <w:p>
       <w:pPr>
-        <w:pStyle w:val="TOC1"/>
+        <w:pStyle w:val="TOC4"/>
+        <w:tabs>
+          <w:tab w:val="right" w:leader="dot" w:pos="8776"/>
+        </w:tabs>
         <w:rPr>
           <w:rFonts w:asciiTheme="minorHAnsi" w:eastAsiaTheme="minorEastAsia" w:hAnsiTheme="minorHAnsi"/>
           <w:noProof/>
@@ -3162,13 +3160,13 @@
           <w14:ligatures w14:val="standardContextual"/>
         </w:rPr>
       </w:pPr>
-      <w:hyperlink w:anchor="_Toc227277613" w:history="1">
+      <w:hyperlink w:anchor="_Toc227708734" w:history="1">
         <w:r>
           <w:rPr>
             <w:rStyle w:val="Hyperlink"/>
             <w:noProof/>
           </w:rPr>
-          <w:t>Mellékletek</w:t>
+          <w:t>Bérléskezelő szolgáltatás – RentalService</w:t>
         </w:r>
         <w:r>
           <w:rPr>
@@ -3189,7 +3187,7 @@
             <w:noProof/>
             <w:webHidden/>
           </w:rPr>
-          <w:instrText xml:space="preserve"> PAGEREF _Toc227277613 \h </w:instrText>
+          <w:instrText xml:space="preserve"> PAGEREF _Toc227708734 \h </w:instrText>
         </w:r>
         <w:r>
           <w:rPr>
@@ -3209,7 +3207,7 @@
             <w:noProof/>
             <w:webHidden/>
           </w:rPr>
-          <w:t>42</w:t>
+          <w:t>38</w:t>
         </w:r>
         <w:r>
           <w:rPr>
@@ -3222,7 +3220,7 @@
     </w:p>
     <w:p>
       <w:pPr>
-        <w:pStyle w:val="TOC2"/>
+        <w:pStyle w:val="TOC3"/>
         <w:tabs>
           <w:tab w:val="right" w:leader="dot" w:pos="8776"/>
         </w:tabs>
@@ -3235,13 +3233,13 @@
           <w14:ligatures w14:val="standardContextual"/>
         </w:rPr>
       </w:pPr>
-      <w:hyperlink w:anchor="_Toc227277614" w:history="1">
+      <w:hyperlink w:anchor="_Toc227708735" w:history="1">
         <w:r>
           <w:rPr>
             <w:rStyle w:val="Hyperlink"/>
             <w:noProof/>
           </w:rPr>
-          <w:t>ER-modell</w:t>
+          <w:t>Válaszszűrőrendszer – VisibilityFiltering</w:t>
         </w:r>
         <w:r>
           <w:rPr>
@@ -3262,7 +3260,7 @@
             <w:noProof/>
             <w:webHidden/>
           </w:rPr>
-          <w:instrText xml:space="preserve"> PAGEREF _Toc227277614 \h </w:instrText>
+          <w:instrText xml:space="preserve"> PAGEREF _Toc227708735 \h </w:instrText>
         </w:r>
         <w:r>
           <w:rPr>
@@ -3282,7 +3280,7 @@
             <w:noProof/>
             <w:webHidden/>
           </w:rPr>
-          <w:t>42</w:t>
+          <w:t>40</w:t>
         </w:r>
         <w:r>
           <w:rPr>
@@ -3295,10 +3293,7 @@
     </w:p>
     <w:p>
       <w:pPr>
-        <w:pStyle w:val="TOC2"/>
-        <w:tabs>
-          <w:tab w:val="right" w:leader="dot" w:pos="8776"/>
-        </w:tabs>
+        <w:pStyle w:val="TOC1"/>
         <w:rPr>
           <w:rFonts w:asciiTheme="minorHAnsi" w:eastAsiaTheme="minorEastAsia" w:hAnsiTheme="minorHAnsi"/>
           <w:noProof/>
@@ -3308,12 +3303,657 @@
           <w14:ligatures w14:val="standardContextual"/>
         </w:rPr>
       </w:pPr>
-      <w:hyperlink w:anchor="_Toc227277615" w:history="1">
+      <w:hyperlink w:anchor="_Toc227708736" w:history="1">
         <w:r>
           <w:rPr>
             <w:rStyle w:val="Hyperlink"/>
             <w:noProof/>
           </w:rPr>
+          <w:t>Működésének műszaki feltételei</w:t>
+        </w:r>
+        <w:r>
+          <w:rPr>
+            <w:noProof/>
+            <w:webHidden/>
+          </w:rPr>
+          <w:tab/>
+        </w:r>
+        <w:r>
+          <w:rPr>
+            <w:noProof/>
+            <w:webHidden/>
+          </w:rPr>
+          <w:fldChar w:fldCharType="begin"/>
+        </w:r>
+        <w:r>
+          <w:rPr>
+            <w:noProof/>
+            <w:webHidden/>
+          </w:rPr>
+          <w:instrText xml:space="preserve"> PAGEREF _Toc227708736 \h </w:instrText>
+        </w:r>
+        <w:r>
+          <w:rPr>
+            <w:noProof/>
+            <w:webHidden/>
+          </w:rPr>
+        </w:r>
+        <w:r>
+          <w:rPr>
+            <w:noProof/>
+            <w:webHidden/>
+          </w:rPr>
+          <w:fldChar w:fldCharType="separate"/>
+        </w:r>
+        <w:r>
+          <w:rPr>
+            <w:noProof/>
+            <w:webHidden/>
+          </w:rPr>
+          <w:t>41</w:t>
+        </w:r>
+        <w:r>
+          <w:rPr>
+            <w:noProof/>
+            <w:webHidden/>
+          </w:rPr>
+          <w:fldChar w:fldCharType="end"/>
+        </w:r>
+      </w:hyperlink>
+    </w:p>
+    <w:p>
+      <w:pPr>
+        <w:pStyle w:val="TOC1"/>
+        <w:rPr>
+          <w:rFonts w:asciiTheme="minorHAnsi" w:eastAsiaTheme="minorEastAsia" w:hAnsiTheme="minorHAnsi"/>
+          <w:noProof/>
+          <w:kern w:val="2"/>
+          <w:szCs w:val="24"/>
+          <w:lang w:val="en-US"/>
+          <w14:ligatures w14:val="standardContextual"/>
+        </w:rPr>
+      </w:pPr>
+      <w:hyperlink w:anchor="_Toc227708737" w:history="1">
+        <w:r>
+          <w:rPr>
+            <w:rStyle w:val="Hyperlink"/>
+            <w:noProof/>
+          </w:rPr>
+          <w:t>Használatának rövid bemutatása</w:t>
+        </w:r>
+        <w:r>
+          <w:rPr>
+            <w:noProof/>
+            <w:webHidden/>
+          </w:rPr>
+          <w:tab/>
+        </w:r>
+        <w:r>
+          <w:rPr>
+            <w:noProof/>
+            <w:webHidden/>
+          </w:rPr>
+          <w:fldChar w:fldCharType="begin"/>
+        </w:r>
+        <w:r>
+          <w:rPr>
+            <w:noProof/>
+            <w:webHidden/>
+          </w:rPr>
+          <w:instrText xml:space="preserve"> PAGEREF _Toc227708737 \h </w:instrText>
+        </w:r>
+        <w:r>
+          <w:rPr>
+            <w:noProof/>
+            <w:webHidden/>
+          </w:rPr>
+        </w:r>
+        <w:r>
+          <w:rPr>
+            <w:noProof/>
+            <w:webHidden/>
+          </w:rPr>
+          <w:fldChar w:fldCharType="separate"/>
+        </w:r>
+        <w:r>
+          <w:rPr>
+            <w:noProof/>
+            <w:webHidden/>
+          </w:rPr>
+          <w:t>42</w:t>
+        </w:r>
+        <w:r>
+          <w:rPr>
+            <w:noProof/>
+            <w:webHidden/>
+          </w:rPr>
+          <w:fldChar w:fldCharType="end"/>
+        </w:r>
+      </w:hyperlink>
+    </w:p>
+    <w:p>
+      <w:pPr>
+        <w:pStyle w:val="TOC1"/>
+        <w:rPr>
+          <w:rFonts w:asciiTheme="minorHAnsi" w:eastAsiaTheme="minorEastAsia" w:hAnsiTheme="minorHAnsi"/>
+          <w:noProof/>
+          <w:kern w:val="2"/>
+          <w:szCs w:val="24"/>
+          <w:lang w:val="en-US"/>
+          <w14:ligatures w14:val="standardContextual"/>
+        </w:rPr>
+      </w:pPr>
+      <w:hyperlink w:anchor="_Toc227708738" w:history="1">
+        <w:r>
+          <w:rPr>
+            <w:rStyle w:val="Hyperlink"/>
+            <w:noProof/>
+          </w:rPr>
+          <w:t>Továbbfejlesztési lehetőségek</w:t>
+        </w:r>
+        <w:r>
+          <w:rPr>
+            <w:noProof/>
+            <w:webHidden/>
+          </w:rPr>
+          <w:tab/>
+        </w:r>
+        <w:r>
+          <w:rPr>
+            <w:noProof/>
+            <w:webHidden/>
+          </w:rPr>
+          <w:fldChar w:fldCharType="begin"/>
+        </w:r>
+        <w:r>
+          <w:rPr>
+            <w:noProof/>
+            <w:webHidden/>
+          </w:rPr>
+          <w:instrText xml:space="preserve"> PAGEREF _Toc227708738 \h </w:instrText>
+        </w:r>
+        <w:r>
+          <w:rPr>
+            <w:noProof/>
+            <w:webHidden/>
+          </w:rPr>
+        </w:r>
+        <w:r>
+          <w:rPr>
+            <w:noProof/>
+            <w:webHidden/>
+          </w:rPr>
+          <w:fldChar w:fldCharType="separate"/>
+        </w:r>
+        <w:r>
+          <w:rPr>
+            <w:noProof/>
+            <w:webHidden/>
+          </w:rPr>
+          <w:t>43</w:t>
+        </w:r>
+        <w:r>
+          <w:rPr>
+            <w:noProof/>
+            <w:webHidden/>
+          </w:rPr>
+          <w:fldChar w:fldCharType="end"/>
+        </w:r>
+      </w:hyperlink>
+    </w:p>
+    <w:p>
+      <w:pPr>
+        <w:pStyle w:val="TOC1"/>
+        <w:rPr>
+          <w:rFonts w:asciiTheme="minorHAnsi" w:eastAsiaTheme="minorEastAsia" w:hAnsiTheme="minorHAnsi"/>
+          <w:noProof/>
+          <w:kern w:val="2"/>
+          <w:szCs w:val="24"/>
+          <w:lang w:val="en-US"/>
+          <w14:ligatures w14:val="standardContextual"/>
+        </w:rPr>
+      </w:pPr>
+      <w:hyperlink w:anchor="_Toc227708739" w:history="1">
+        <w:r>
+          <w:rPr>
+            <w:rStyle w:val="Hyperlink"/>
+            <w:noProof/>
+          </w:rPr>
+          <w:t>Tesztdokumentáció</w:t>
+        </w:r>
+        <w:r>
+          <w:rPr>
+            <w:noProof/>
+            <w:webHidden/>
+          </w:rPr>
+          <w:tab/>
+        </w:r>
+        <w:r>
+          <w:rPr>
+            <w:noProof/>
+            <w:webHidden/>
+          </w:rPr>
+          <w:fldChar w:fldCharType="begin"/>
+        </w:r>
+        <w:r>
+          <w:rPr>
+            <w:noProof/>
+            <w:webHidden/>
+          </w:rPr>
+          <w:instrText xml:space="preserve"> PAGEREF _Toc227708739 \h </w:instrText>
+        </w:r>
+        <w:r>
+          <w:rPr>
+            <w:noProof/>
+            <w:webHidden/>
+          </w:rPr>
+        </w:r>
+        <w:r>
+          <w:rPr>
+            <w:noProof/>
+            <w:webHidden/>
+          </w:rPr>
+          <w:fldChar w:fldCharType="separate"/>
+        </w:r>
+        <w:r>
+          <w:rPr>
+            <w:noProof/>
+            <w:webHidden/>
+          </w:rPr>
+          <w:t>44</w:t>
+        </w:r>
+        <w:r>
+          <w:rPr>
+            <w:noProof/>
+            <w:webHidden/>
+          </w:rPr>
+          <w:fldChar w:fldCharType="end"/>
+        </w:r>
+      </w:hyperlink>
+    </w:p>
+    <w:p>
+      <w:pPr>
+        <w:pStyle w:val="TOC2"/>
+        <w:tabs>
+          <w:tab w:val="right" w:leader="dot" w:pos="8776"/>
+        </w:tabs>
+        <w:rPr>
+          <w:rFonts w:asciiTheme="minorHAnsi" w:eastAsiaTheme="minorEastAsia" w:hAnsiTheme="minorHAnsi"/>
+          <w:noProof/>
+          <w:kern w:val="2"/>
+          <w:szCs w:val="24"/>
+          <w:lang w:val="en-US"/>
+          <w14:ligatures w14:val="standardContextual"/>
+        </w:rPr>
+      </w:pPr>
+      <w:hyperlink w:anchor="_Toc227708740" w:history="1">
+        <w:r>
+          <w:rPr>
+            <w:rStyle w:val="Hyperlink"/>
+            <w:noProof/>
+          </w:rPr>
+          <w:t>TestHandler</w:t>
+        </w:r>
+        <w:r>
+          <w:rPr>
+            <w:noProof/>
+            <w:webHidden/>
+          </w:rPr>
+          <w:tab/>
+        </w:r>
+        <w:r>
+          <w:rPr>
+            <w:noProof/>
+            <w:webHidden/>
+          </w:rPr>
+          <w:fldChar w:fldCharType="begin"/>
+        </w:r>
+        <w:r>
+          <w:rPr>
+            <w:noProof/>
+            <w:webHidden/>
+          </w:rPr>
+          <w:instrText xml:space="preserve"> PAGEREF _Toc227708740 \h </w:instrText>
+        </w:r>
+        <w:r>
+          <w:rPr>
+            <w:noProof/>
+            <w:webHidden/>
+          </w:rPr>
+        </w:r>
+        <w:r>
+          <w:rPr>
+            <w:noProof/>
+            <w:webHidden/>
+          </w:rPr>
+          <w:fldChar w:fldCharType="separate"/>
+        </w:r>
+        <w:r>
+          <w:rPr>
+            <w:noProof/>
+            <w:webHidden/>
+          </w:rPr>
+          <w:t>44</w:t>
+        </w:r>
+        <w:r>
+          <w:rPr>
+            <w:noProof/>
+            <w:webHidden/>
+          </w:rPr>
+          <w:fldChar w:fldCharType="end"/>
+        </w:r>
+      </w:hyperlink>
+    </w:p>
+    <w:p>
+      <w:pPr>
+        <w:pStyle w:val="TOC2"/>
+        <w:tabs>
+          <w:tab w:val="right" w:leader="dot" w:pos="8776"/>
+        </w:tabs>
+        <w:rPr>
+          <w:rFonts w:asciiTheme="minorHAnsi" w:eastAsiaTheme="minorEastAsia" w:hAnsiTheme="minorHAnsi"/>
+          <w:noProof/>
+          <w:kern w:val="2"/>
+          <w:szCs w:val="24"/>
+          <w:lang w:val="en-US"/>
+          <w14:ligatures w14:val="standardContextual"/>
+        </w:rPr>
+      </w:pPr>
+      <w:hyperlink w:anchor="_Toc227708741" w:history="1">
+        <w:r>
+          <w:rPr>
+            <w:rStyle w:val="Hyperlink"/>
+            <w:noProof/>
+          </w:rPr>
+          <w:t>Kontroller metódusok tesztelése</w:t>
+        </w:r>
+        <w:r>
+          <w:rPr>
+            <w:noProof/>
+            <w:webHidden/>
+          </w:rPr>
+          <w:tab/>
+        </w:r>
+        <w:r>
+          <w:rPr>
+            <w:noProof/>
+            <w:webHidden/>
+          </w:rPr>
+          <w:fldChar w:fldCharType="begin"/>
+        </w:r>
+        <w:r>
+          <w:rPr>
+            <w:noProof/>
+            <w:webHidden/>
+          </w:rPr>
+          <w:instrText xml:space="preserve"> PAGEREF _Toc227708741 \h </w:instrText>
+        </w:r>
+        <w:r>
+          <w:rPr>
+            <w:noProof/>
+            <w:webHidden/>
+          </w:rPr>
+        </w:r>
+        <w:r>
+          <w:rPr>
+            <w:noProof/>
+            <w:webHidden/>
+          </w:rPr>
+          <w:fldChar w:fldCharType="separate"/>
+        </w:r>
+        <w:r>
+          <w:rPr>
+            <w:noProof/>
+            <w:webHidden/>
+          </w:rPr>
+          <w:t>44</w:t>
+        </w:r>
+        <w:r>
+          <w:rPr>
+            <w:noProof/>
+            <w:webHidden/>
+          </w:rPr>
+          <w:fldChar w:fldCharType="end"/>
+        </w:r>
+      </w:hyperlink>
+    </w:p>
+    <w:p>
+      <w:pPr>
+        <w:pStyle w:val="TOC2"/>
+        <w:tabs>
+          <w:tab w:val="right" w:leader="dot" w:pos="8776"/>
+        </w:tabs>
+        <w:rPr>
+          <w:rFonts w:asciiTheme="minorHAnsi" w:eastAsiaTheme="minorEastAsia" w:hAnsiTheme="minorHAnsi"/>
+          <w:noProof/>
+          <w:kern w:val="2"/>
+          <w:szCs w:val="24"/>
+          <w:lang w:val="en-US"/>
+          <w14:ligatures w14:val="standardContextual"/>
+        </w:rPr>
+      </w:pPr>
+      <w:hyperlink w:anchor="_Toc227708742" w:history="1">
+        <w:r>
+          <w:rPr>
+            <w:rStyle w:val="Hyperlink"/>
+            <w:noProof/>
+          </w:rPr>
+          <w:t>Stressztesztelés</w:t>
+        </w:r>
+        <w:r>
+          <w:rPr>
+            <w:noProof/>
+            <w:webHidden/>
+          </w:rPr>
+          <w:tab/>
+        </w:r>
+        <w:r>
+          <w:rPr>
+            <w:noProof/>
+            <w:webHidden/>
+          </w:rPr>
+          <w:fldChar w:fldCharType="begin"/>
+        </w:r>
+        <w:r>
+          <w:rPr>
+            <w:noProof/>
+            <w:webHidden/>
+          </w:rPr>
+          <w:instrText xml:space="preserve"> PAGEREF _Toc227708742 \h </w:instrText>
+        </w:r>
+        <w:r>
+          <w:rPr>
+            <w:noProof/>
+            <w:webHidden/>
+          </w:rPr>
+        </w:r>
+        <w:r>
+          <w:rPr>
+            <w:noProof/>
+            <w:webHidden/>
+          </w:rPr>
+          <w:fldChar w:fldCharType="separate"/>
+        </w:r>
+        <w:r>
+          <w:rPr>
+            <w:noProof/>
+            <w:webHidden/>
+          </w:rPr>
+          <w:t>45</w:t>
+        </w:r>
+        <w:r>
+          <w:rPr>
+            <w:noProof/>
+            <w:webHidden/>
+          </w:rPr>
+          <w:fldChar w:fldCharType="end"/>
+        </w:r>
+      </w:hyperlink>
+    </w:p>
+    <w:p>
+      <w:pPr>
+        <w:pStyle w:val="TOC1"/>
+        <w:rPr>
+          <w:rFonts w:asciiTheme="minorHAnsi" w:eastAsiaTheme="minorEastAsia" w:hAnsiTheme="minorHAnsi"/>
+          <w:noProof/>
+          <w:kern w:val="2"/>
+          <w:szCs w:val="24"/>
+          <w:lang w:val="en-US"/>
+          <w14:ligatures w14:val="standardContextual"/>
+        </w:rPr>
+      </w:pPr>
+      <w:hyperlink w:anchor="_Toc227708743" w:history="1">
+        <w:r>
+          <w:rPr>
+            <w:rStyle w:val="Hyperlink"/>
+            <w:noProof/>
+          </w:rPr>
+          <w:t>Mellékletek</w:t>
+        </w:r>
+        <w:r>
+          <w:rPr>
+            <w:noProof/>
+            <w:webHidden/>
+          </w:rPr>
+          <w:tab/>
+        </w:r>
+        <w:r>
+          <w:rPr>
+            <w:noProof/>
+            <w:webHidden/>
+          </w:rPr>
+          <w:fldChar w:fldCharType="begin"/>
+        </w:r>
+        <w:r>
+          <w:rPr>
+            <w:noProof/>
+            <w:webHidden/>
+          </w:rPr>
+          <w:instrText xml:space="preserve"> PAGEREF _Toc227708743 \h </w:instrText>
+        </w:r>
+        <w:r>
+          <w:rPr>
+            <w:noProof/>
+            <w:webHidden/>
+          </w:rPr>
+        </w:r>
+        <w:r>
+          <w:rPr>
+            <w:noProof/>
+            <w:webHidden/>
+          </w:rPr>
+          <w:fldChar w:fldCharType="separate"/>
+        </w:r>
+        <w:r>
+          <w:rPr>
+            <w:noProof/>
+            <w:webHidden/>
+          </w:rPr>
+          <w:t>46</w:t>
+        </w:r>
+        <w:r>
+          <w:rPr>
+            <w:noProof/>
+            <w:webHidden/>
+          </w:rPr>
+          <w:fldChar w:fldCharType="end"/>
+        </w:r>
+      </w:hyperlink>
+    </w:p>
+    <w:p>
+      <w:pPr>
+        <w:pStyle w:val="TOC2"/>
+        <w:tabs>
+          <w:tab w:val="right" w:leader="dot" w:pos="8776"/>
+        </w:tabs>
+        <w:rPr>
+          <w:rFonts w:asciiTheme="minorHAnsi" w:eastAsiaTheme="minorEastAsia" w:hAnsiTheme="minorHAnsi"/>
+          <w:noProof/>
+          <w:kern w:val="2"/>
+          <w:szCs w:val="24"/>
+          <w:lang w:val="en-US"/>
+          <w14:ligatures w14:val="standardContextual"/>
+        </w:rPr>
+      </w:pPr>
+      <w:hyperlink w:anchor="_Toc227708744" w:history="1">
+        <w:r>
+          <w:rPr>
+            <w:rStyle w:val="Hyperlink"/>
+            <w:noProof/>
+          </w:rPr>
+          <w:t>ER-modell</w:t>
+        </w:r>
+        <w:r>
+          <w:rPr>
+            <w:noProof/>
+            <w:webHidden/>
+          </w:rPr>
+          <w:tab/>
+        </w:r>
+        <w:r>
+          <w:rPr>
+            <w:noProof/>
+            <w:webHidden/>
+          </w:rPr>
+          <w:fldChar w:fldCharType="begin"/>
+        </w:r>
+        <w:r>
+          <w:rPr>
+            <w:noProof/>
+            <w:webHidden/>
+          </w:rPr>
+          <w:instrText xml:space="preserve"> PAGEREF _Toc227708744 \h </w:instrText>
+        </w:r>
+        <w:r>
+          <w:rPr>
+            <w:noProof/>
+            <w:webHidden/>
+          </w:rPr>
+        </w:r>
+        <w:r>
+          <w:rPr>
+            <w:noProof/>
+            <w:webHidden/>
+          </w:rPr>
+          <w:fldChar w:fldCharType="separate"/>
+        </w:r>
+        <w:r>
+          <w:rPr>
+            <w:noProof/>
+            <w:webHidden/>
+          </w:rPr>
+          <w:t>46</w:t>
+        </w:r>
+        <w:r>
+          <w:rPr>
+            <w:noProof/>
+            <w:webHidden/>
+          </w:rPr>
+          <w:fldChar w:fldCharType="end"/>
+        </w:r>
+      </w:hyperlink>
+    </w:p>
+    <w:p>
+      <w:pPr>
+        <w:pStyle w:val="TOC2"/>
+        <w:tabs>
+          <w:tab w:val="right" w:leader="dot" w:pos="8776"/>
+        </w:tabs>
+        <w:rPr>
+          <w:rFonts w:asciiTheme="minorHAnsi" w:eastAsiaTheme="minorEastAsia" w:hAnsiTheme="minorHAnsi"/>
+          <w:noProof/>
+          <w:kern w:val="2"/>
+          <w:szCs w:val="24"/>
+          <w:lang w:val="en-US"/>
+          <w14:ligatures w14:val="standardContextual"/>
+        </w:rPr>
+      </w:pPr>
+      <w:hyperlink w:anchor="_Toc227708745" w:history="1">
+        <w:r>
+          <w:rPr>
+            <w:rStyle w:val="Hyperlink"/>
+            <w:noProof/>
+          </w:rPr>
           <w:t>Relációs diagramm</w:t>
         </w:r>
         <w:r>
@@ -3335,7 +3975,7 @@
             <w:noProof/>
             <w:webHidden/>
           </w:rPr>
-          <w:instrText xml:space="preserve"> PAGEREF _Toc227277615 \h </w:instrText>
+          <w:instrText xml:space="preserve"> PAGEREF _Toc227708745 \h </w:instrText>
         </w:r>
         <w:r>
           <w:rPr>
@@ -3355,7 +3995,7 @@
             <w:noProof/>
             <w:webHidden/>
           </w:rPr>
-          <w:t>43</w:t>
+          <w:t>47</w:t>
         </w:r>
         <w:r>
           <w:rPr>
@@ -3404,7 +4044,7 @@
         <w:pStyle w:val="Heading1"/>
         <w:suppressAutoHyphens/>
       </w:pPr>
-      <w:bookmarkStart w:id="0" w:name="_Toc227277576"/>
+      <w:bookmarkStart w:id="0" w:name="_Toc227708697"/>
       <w:r>
         <w:lastRenderedPageBreak/>
         <w:t>Bevezetés</w:t>
@@ -3415,45 +4055,21 @@
       <w:pPr>
         <w:pStyle w:val="Heading2"/>
       </w:pPr>
-      <w:bookmarkStart w:id="1" w:name="_Toc227277577"/>
-      <w:r>
-        <w:t xml:space="preserve">Mi az a </w:t>
-      </w:r>
-      <w:proofErr w:type="spellStart"/>
-      <w:r>
-        <w:t>CoMove</w:t>
-      </w:r>
-      <w:proofErr w:type="spellEnd"/>
-      <w:r>
-        <w:t>?</w:t>
+      <w:bookmarkStart w:id="1" w:name="_Toc227708698"/>
+      <w:r>
+        <w:t>Mi az a CoMove?</w:t>
       </w:r>
       <w:bookmarkEnd w:id="1"/>
     </w:p>
     <w:p>
       <w:r>
-        <w:t xml:space="preserve">Az alábbi dokumentáció a </w:t>
-      </w:r>
-      <w:proofErr w:type="spellStart"/>
-      <w:r>
-        <w:t>CoMove</w:t>
-      </w:r>
-      <w:proofErr w:type="spellEnd"/>
-      <w:r>
-        <w:t xml:space="preserve"> elnevezésű projektmunkánkat mutatja be,</w:t>
+        <w:t>Az alábbi dokumentáció a CoMove elnevezésű projektmunkánkat mutatja be,</w:t>
       </w:r>
       <w:r>
         <w:t xml:space="preserve"> </w:t>
       </w:r>
       <w:r>
-        <w:t xml:space="preserve">amely egy közösségi autómegosztó platform. A </w:t>
-      </w:r>
-      <w:proofErr w:type="spellStart"/>
-      <w:r>
-        <w:t>CoMove</w:t>
-      </w:r>
-      <w:proofErr w:type="spellEnd"/>
-      <w:r>
-        <w:t xml:space="preserve"> egy olyan webes felület,</w:t>
+        <w:t>amely egy közösségi autómegosztó platform. A CoMove egy olyan webes felület,</w:t>
       </w:r>
       <w:r>
         <w:t xml:space="preserve"> </w:t>
@@ -3490,7 +4106,7 @@
       <w:pPr>
         <w:pStyle w:val="Heading2"/>
       </w:pPr>
-      <w:bookmarkStart w:id="2" w:name="_Toc227277578"/>
+      <w:bookmarkStart w:id="2" w:name="_Toc227708699"/>
       <w:r>
         <w:t>Témaválasztás indoklása</w:t>
       </w:r>
@@ -3508,15 +4124,7 @@
     </w:p>
     <w:p>
       <w:r>
-        <w:t xml:space="preserve">Fontos szempont volt számunkra a környezettudatosság is. Hiszünk abban, hogy a jövő nem a több autó gyártásában, hanem a meglévők okosabb kihasználásában rejlik. A </w:t>
-      </w:r>
-      <w:proofErr w:type="spellStart"/>
-      <w:r>
-        <w:t>CoMove</w:t>
-      </w:r>
-      <w:proofErr w:type="spellEnd"/>
-      <w:r>
-        <w:t xml:space="preserve"> választásával egy olyan modellt alkothattunk meg, amely segíti a közösségi összefogást és csökkenti a felesleges kiadásokat.</w:t>
+        <w:t>Fontos szempont volt számunkra a környezettudatosság is. Hiszünk abban, hogy a jövő nem a több autó gyártásában, hanem a meglévők okosabb kihasználásában rejlik. A CoMove választásával egy olyan modellt alkothattunk meg, amely segíti a közösségi összefogást és csökkenti a felesleges kiadásokat.</w:t>
       </w:r>
     </w:p>
     <w:p>
@@ -3532,10 +4140,12 @@
       <w:pPr>
         <w:pStyle w:val="Heading2"/>
       </w:pPr>
+      <w:bookmarkStart w:id="3" w:name="_Toc227708700"/>
       <w:r>
         <w:lastRenderedPageBreak/>
         <w:t>Hasonló szolgáltatások</w:t>
       </w:r>
+      <w:bookmarkEnd w:id="3"/>
     </w:p>
     <w:p>
       <w:r>
@@ -3586,23 +4196,7 @@
           <w:b/>
           <w:bCs/>
         </w:rPr>
-        <w:t xml:space="preserve">Miben kínál mást a </w:t>
-      </w:r>
-      <w:proofErr w:type="spellStart"/>
-      <w:r>
-        <w:rPr>
-          <w:b/>
-          <w:bCs/>
-        </w:rPr>
-        <w:t>CoMove</w:t>
-      </w:r>
-      <w:proofErr w:type="spellEnd"/>
-      <w:r>
-        <w:rPr>
-          <w:b/>
-          <w:bCs/>
-        </w:rPr>
-        <w:t>?</w:t>
+        <w:t>Miben kínál mást a CoMove?</w:t>
       </w:r>
     </w:p>
     <w:p>
@@ -3621,6 +4215,10 @@
       </w:r>
     </w:p>
     <w:p>
+      <w:pPr>
+        <w:spacing w:after="160" w:line="259" w:lineRule="auto"/>
+        <w:jc w:val="left"/>
+      </w:pPr>
       <w:r>
         <w:br w:type="page"/>
       </w:r>
@@ -3628,24 +4226,388 @@
     <w:p>
       <w:pPr>
         <w:pStyle w:val="Heading1"/>
-        <w:suppressAutoHyphens/>
-      </w:pPr>
-      <w:bookmarkStart w:id="3" w:name="_Toc227277579"/>
+      </w:pPr>
+      <w:bookmarkStart w:id="4" w:name="_Toc227708701"/>
+      <w:r>
+        <w:lastRenderedPageBreak/>
+        <w:t>A szoftver műszaki feltételei és futtatása</w:t>
+      </w:r>
+      <w:bookmarkEnd w:id="4"/>
+    </w:p>
+    <w:p>
+      <w:pPr>
+        <w:pStyle w:val="Heading2"/>
+      </w:pPr>
+      <w:bookmarkStart w:id="5" w:name="_Toc227708702"/>
+      <w:r>
+        <w:t>Adatbázis</w:t>
+      </w:r>
+      <w:bookmarkEnd w:id="5"/>
+    </w:p>
+    <w:p>
+      <w:r>
+        <w:t>Az adatbázis MySQL</w:t>
+      </w:r>
+      <w:r>
+        <w:t xml:space="preserve"> alapú, így, hogy hozzáférjük ahhoz, szükséges egy MySQL szerver telepítése, majd az adatbázis-dump beimportálása. Mi ehhez XAMPP-ot használtu</w:t>
+      </w:r>
+      <w:r>
+        <w:t>n</w:t>
+      </w:r>
+      <w:r>
+        <w:t xml:space="preserve">k, mivel </w:t>
+      </w:r>
+      <w:r>
+        <w:t xml:space="preserve">segítségével </w:t>
+      </w:r>
+      <w:r>
+        <w:t>a MySQL szerver</w:t>
+      </w:r>
+      <w:r>
+        <w:t xml:space="preserve"> </w:t>
+      </w:r>
+      <w:r>
+        <w:t>könnyen indítható, az adatbázis-dump pedig könnyen importálható phpMyAdmin</w:t>
+      </w:r>
+      <w:r>
+        <w:t>-ban</w:t>
+      </w:r>
+      <w:r>
+        <w:t>.</w:t>
+      </w:r>
+      <w:r>
+        <w:t xml:space="preserve"> Fontos, hogy telepítés után</w:t>
+      </w:r>
+      <w:r>
+        <w:rPr>
+          <w:lang w:val="en-US"/>
+        </w:rPr>
+        <w:t xml:space="preserve"> a My</w:t>
+      </w:r>
+      <w:r>
+        <w:t xml:space="preserve">SQL szerver a 3306-os porton fut, azonban a backend azt a 3307-es porton várja, </w:t>
+      </w:r>
+      <w:r>
+        <w:t>így</w:t>
+      </w:r>
+      <w:r>
+        <w:t xml:space="preserve"> vagy a MySQL konfigurá</w:t>
+      </w:r>
+      <w:r>
+        <w:t>ciójá</w:t>
+      </w:r>
+      <w:r>
+        <w:t xml:space="preserve">t változtatjuk meg </w:t>
+      </w:r>
+      <w:r>
+        <w:t xml:space="preserve">(a my.ini fájlban </w:t>
+      </w:r>
+      <w:r>
+        <w:t>írjuk át</w:t>
+      </w:r>
+      <w:r>
+        <w:t xml:space="preserve"> a portot), vagy a backend </w:t>
+      </w:r>
+      <w:r>
+        <w:t>ConnectionString-jét (az appsettings.json-ben írjuk át a portot)</w:t>
+      </w:r>
+      <w:r>
+        <w:t>.</w:t>
+      </w:r>
+    </w:p>
+    <w:p>
+      <w:pPr>
+        <w:pStyle w:val="Heading2"/>
+      </w:pPr>
+      <w:bookmarkStart w:id="6" w:name="_Toc227708703"/>
+      <w:r>
+        <w:t>Backend</w:t>
+      </w:r>
+      <w:bookmarkEnd w:id="6"/>
+    </w:p>
+    <w:p>
+      <w:pPr>
+        <w:rPr>
+          <w:lang w:val="en-US"/>
+        </w:rPr>
+      </w:pPr>
+      <w:r>
+        <w:t>A szoftver backend része ASP.NET Core-on alapul, .NET 8-as verzión</w:t>
+      </w:r>
+      <w:r>
+        <w:t xml:space="preserve"> és </w:t>
+      </w:r>
+      <w:r>
+        <w:rPr>
+          <w:lang w:val="en-US"/>
+        </w:rPr>
+        <w:t xml:space="preserve">C#-ban </w:t>
+      </w:r>
+      <w:r>
+        <w:t>íródott</w:t>
+      </w:r>
+      <w:r>
+        <w:t>. Ez legkönnyebben Visual Studio-ból futtatható.</w:t>
+      </w:r>
+      <w:r>
+        <w:t xml:space="preserve"> A</w:t>
+      </w:r>
+      <w:r>
+        <w:t xml:space="preserve"> projekt építése</w:t>
+      </w:r>
+      <w:r>
+        <w:t xml:space="preserve"> </w:t>
+      </w:r>
+      <w:r>
+        <w:t>(build) során ez elméletileg letölti a szükséges könyvtára</w:t>
+      </w:r>
+      <w:r>
+        <w:t>kat/csomagokat</w:t>
+      </w:r>
+      <w:r>
+        <w:t>, mint a MySQL.EntityFrameworkCore, a FileTypeChecker, vagy a Resend.</w:t>
+      </w:r>
+      <w:r>
+        <w:t xml:space="preserve"> A projekt </w:t>
+      </w:r>
+      <w:r>
+        <w:rPr>
+          <w:b/>
+          <w:bCs/>
+        </w:rPr>
+        <w:t>https</w:t>
+      </w:r>
+      <w:r>
+        <w:t xml:space="preserve">-en a </w:t>
+      </w:r>
+      <w:r>
+        <w:rPr>
+          <w:b/>
+          <w:bCs/>
+        </w:rPr>
+        <w:t>7245</w:t>
+      </w:r>
+      <w:r>
+        <w:t xml:space="preserve">-ös porton fut, </w:t>
+      </w:r>
+      <w:r>
+        <w:rPr>
+          <w:b/>
+          <w:bCs/>
+        </w:rPr>
+        <w:t>http</w:t>
+      </w:r>
+      <w:r>
+        <w:t xml:space="preserve">-n pedig az </w:t>
+      </w:r>
+      <w:r>
+        <w:rPr>
+          <w:b/>
+          <w:bCs/>
+        </w:rPr>
+        <w:t>5126</w:t>
+      </w:r>
+      <w:r>
+        <w:t>-oson.</w:t>
+      </w:r>
+      <w:r>
+        <w:t xml:space="preserve"> Első https-sel történő futtatáskor el kell fogadni a felugró ablakokat, amelyek szerint egy SSL </w:t>
+      </w:r>
+      <w:r>
+        <w:t>tanúsítványokat</w:t>
+      </w:r>
+      <w:r>
+        <w:t xml:space="preserve"> fogadtat el a számítógépünkkel a Visual Studio, másképpen nem tudnánk https-sel futtatni a backendet.</w:t>
+      </w:r>
+      <w:r>
+        <w:t xml:space="preserve"> </w:t>
+      </w:r>
+      <w:r>
+        <w:t>Fontos</w:t>
+      </w:r>
+      <w:r>
+        <w:t xml:space="preserve">, hogy amennyiben </w:t>
+      </w:r>
+      <w:r>
+        <w:rPr>
+          <w:b/>
+          <w:bCs/>
+        </w:rPr>
+        <w:t>nem https</w:t>
+      </w:r>
+      <w:r>
+        <w:t xml:space="preserve">-t használunk </w:t>
+      </w:r>
+      <w:r>
+        <w:t>a változtatások szerint</w:t>
+      </w:r>
+      <w:r>
+        <w:t xml:space="preserve"> kell módosítani a HttpOnly </w:t>
+      </w:r>
+      <w:proofErr w:type="gramStart"/>
+      <w:r>
+        <w:t>sütik</w:t>
+      </w:r>
+      <w:proofErr w:type="gramEnd"/>
+      <w:r>
+        <w:t xml:space="preserve"> beállításait.</w:t>
+      </w:r>
+    </w:p>
+    <w:p>
+      <w:r>
+        <w:rPr>
+          <w:lang w:val="en-US"/>
+        </w:rPr>
+        <w:t>A</w:t>
+      </w:r>
+      <w:r>
+        <w:rPr>
+          <w:lang w:val="en-US"/>
+        </w:rPr>
+        <w:t xml:space="preserve">z e-mail küldő </w:t>
+      </w:r>
+      <w:r>
+        <w:t xml:space="preserve">funkcionalitás a </w:t>
+      </w:r>
+      <w:r>
+        <w:rPr>
+          <w:b/>
+          <w:bCs/>
+        </w:rPr>
+        <w:t>Resend</w:t>
+      </w:r>
+      <w:r>
+        <w:t xml:space="preserve"> API-val működik, ehhez szükség van egy API kulcsra, amit az Auth:</w:t>
+      </w:r>
+      <w:r>
+        <w:t>Mail:Resend:Token alatt kell tárolni az appsettings-ben</w:t>
+      </w:r>
+      <w:r>
+        <w:t xml:space="preserve"> (jobb esetben a .NET User Secrets-ben</w:t>
+      </w:r>
+      <w:r>
+        <w:t xml:space="preserve"> vagy környezeti változókban)</w:t>
+      </w:r>
+      <w:r>
+        <w:t>, másképpen a funkció</w:t>
+      </w:r>
+      <w:r>
+        <w:t xml:space="preserve"> nem elérhető.</w:t>
+      </w:r>
+    </w:p>
+    <w:p>
+      <w:pPr>
+        <w:pStyle w:val="Heading2"/>
+      </w:pPr>
+      <w:bookmarkStart w:id="7" w:name="_Toc227708704"/>
+      <w:r>
+        <w:t>Frontend</w:t>
+      </w:r>
+      <w:bookmarkEnd w:id="7"/>
+    </w:p>
+    <w:p>
+      <w:r>
+        <w:t>A frontend futtatásához/építéséhez (build) Node.js 24.15.0-ás verzió szükséges npm-mel.</w:t>
+      </w:r>
+      <w:r>
+        <w:t xml:space="preserve"> A CoMove mappában adjuk ki az </w:t>
+      </w:r>
+      <w:r>
+        <w:rPr>
+          <w:i/>
+          <w:iCs/>
+          <w:u w:val="single"/>
+        </w:rPr>
+        <w:t>npm install</w:t>
+      </w:r>
+      <w:r>
+        <w:t xml:space="preserve"> parancsot, majd várjuk meg amíg feltelepül a Vite és a további frontendhez szükséges csomagok</w:t>
+      </w:r>
+      <w:r>
+        <w:t>, mint a Mantine, a Tanstack Query vagy az ikoncsomagok.</w:t>
+      </w:r>
+      <w:r>
+        <w:t xml:space="preserve"> Miután a csomagok sikeresen települtek</w:t>
+      </w:r>
+      <w:r>
+        <w:t xml:space="preserve"> az </w:t>
+      </w:r>
+      <w:r>
+        <w:rPr>
+          <w:i/>
+          <w:iCs/>
+          <w:u w:val="single"/>
+        </w:rPr>
+        <w:t>npm run dev</w:t>
+      </w:r>
+      <w:r>
+        <w:t xml:space="preserve"> parancs kiadásával tudjuk elindítani a frontendet fejlesztői módban. Amennyiben statikus fájlokká szeretnénk exportálni az </w:t>
+      </w:r>
+      <w:r>
+        <w:rPr>
+          <w:i/>
+          <w:iCs/>
+          <w:u w:val="single"/>
+        </w:rPr>
+        <w:t>npm run build</w:t>
+      </w:r>
+      <w:r>
+        <w:t xml:space="preserve"> parancsot kell kiadnunk.</w:t>
+      </w:r>
+      <w:r>
+        <w:t xml:space="preserve"> Fontos, hogy a frontend alapvetően </w:t>
+      </w:r>
+      <w:r>
+        <w:rPr>
+          <w:b/>
+          <w:bCs/>
+        </w:rPr>
+        <w:t>https</w:t>
+      </w:r>
+      <w:r>
+        <w:t xml:space="preserve">-en próbál kapcsolatba lépni a backend-el. Ezt a </w:t>
+      </w:r>
+      <w:r>
+        <w:rPr>
+          <w:i/>
+          <w:iCs/>
+        </w:rPr>
+        <w:t>Config.js</w:t>
+      </w:r>
+      <w:r>
+        <w:t xml:space="preserve">-ben átírhatjuk, vagy </w:t>
+      </w:r>
+      <w:r>
+        <w:t>megadhatunk</w:t>
+      </w:r>
+      <w:r>
+        <w:t xml:space="preserve"> másik backend útvonalat környezeti változók segítségével.</w:t>
+      </w:r>
+      <w:r>
+        <w:br w:type="page"/>
+      </w:r>
+    </w:p>
+    <w:p>
+      <w:pPr>
+        <w:pStyle w:val="Heading1"/>
+        <w:suppressAutoHyphens/>
+      </w:pPr>
+      <w:bookmarkStart w:id="8" w:name="_Toc227708705"/>
       <w:r>
         <w:lastRenderedPageBreak/>
         <w:t>Fejlesztői környezet</w:t>
       </w:r>
-      <w:bookmarkEnd w:id="3"/>
+      <w:bookmarkEnd w:id="8"/>
     </w:p>
     <w:p>
       <w:pPr>
         <w:pStyle w:val="Heading2"/>
       </w:pPr>
-      <w:bookmarkStart w:id="4" w:name="_Toc227277580"/>
+      <w:bookmarkStart w:id="9" w:name="_Toc227708706"/>
       <w:r>
         <w:t>Frontend</w:t>
       </w:r>
-      <w:bookmarkEnd w:id="4"/>
+      <w:bookmarkEnd w:id="9"/>
     </w:p>
     <w:p>
       <w:r>
@@ -3656,24 +4618,24 @@
       <w:pPr>
         <w:pStyle w:val="Heading2"/>
       </w:pPr>
-      <w:bookmarkStart w:id="5" w:name="_Toc227277581"/>
+      <w:bookmarkStart w:id="10" w:name="_Toc227708707"/>
       <w:r>
         <w:t>Backend</w:t>
       </w:r>
       <w:r>
         <w:t xml:space="preserve"> és Adatbázis</w:t>
       </w:r>
-      <w:bookmarkEnd w:id="5"/>
+      <w:bookmarkEnd w:id="10"/>
     </w:p>
     <w:p>
       <w:pPr>
         <w:pStyle w:val="Heading3"/>
       </w:pPr>
-      <w:bookmarkStart w:id="6" w:name="_Toc227277582"/>
+      <w:bookmarkStart w:id="11" w:name="_Toc227708708"/>
       <w:r>
         <w:t>Windows</w:t>
       </w:r>
-      <w:bookmarkEnd w:id="6"/>
+      <w:bookmarkEnd w:id="11"/>
     </w:p>
     <w:p>
       <w:pPr>
@@ -3705,11 +4667,11 @@
       <w:pPr>
         <w:pStyle w:val="Heading3"/>
       </w:pPr>
-      <w:bookmarkStart w:id="7" w:name="_Toc227277583"/>
+      <w:bookmarkStart w:id="12" w:name="_Toc227708709"/>
       <w:r>
         <w:t>MacOS</w:t>
       </w:r>
-      <w:bookmarkEnd w:id="7"/>
+      <w:bookmarkEnd w:id="12"/>
     </w:p>
     <w:p>
       <w:r>
@@ -3725,11 +4687,11 @@
       <w:pPr>
         <w:pStyle w:val="Heading2"/>
       </w:pPr>
-      <w:bookmarkStart w:id="8" w:name="_Toc227277584"/>
+      <w:bookmarkStart w:id="13" w:name="_Toc227708710"/>
       <w:r>
         <w:t>Kollaboráció</w:t>
       </w:r>
-      <w:bookmarkEnd w:id="8"/>
+      <w:bookmarkEnd w:id="13"/>
     </w:p>
     <w:p>
       <w:r>
@@ -3739,6 +4701,7 @@
         <w:t>, a GitHubon található Kanban táblával osztottuk be és rendszereztük a feladatokat.</w:t>
       </w:r>
     </w:p>
+    <w:p/>
     <w:p>
       <w:pPr>
         <w:suppressAutoHyphens/>
@@ -3754,7 +4717,7 @@
         <w:pStyle w:val="Heading1"/>
         <w:suppressAutoHyphens/>
       </w:pPr>
-      <w:bookmarkStart w:id="9" w:name="_Toc227277585"/>
+      <w:bookmarkStart w:id="14" w:name="_Toc227708711"/>
       <w:r>
         <w:lastRenderedPageBreak/>
         <w:t>Komponensek technikai leírás</w:t>
@@ -3762,7 +4725,7 @@
       <w:r>
         <w:t>a</w:t>
       </w:r>
-      <w:bookmarkEnd w:id="9"/>
+      <w:bookmarkEnd w:id="14"/>
     </w:p>
     <w:p>
       <w:pPr>
@@ -3777,11 +4740,11 @@
         <w:pStyle w:val="Heading2"/>
         <w:suppressAutoHyphens/>
       </w:pPr>
-      <w:bookmarkStart w:id="10" w:name="_Toc227277586"/>
+      <w:bookmarkStart w:id="15" w:name="_Toc227708712"/>
       <w:r>
         <w:t>Adatbázis</w:t>
       </w:r>
-      <w:bookmarkEnd w:id="10"/>
+      <w:bookmarkEnd w:id="15"/>
     </w:p>
     <w:p>
       <w:pPr>
@@ -3803,25 +4766,15 @@
         <w:fldChar w:fldCharType="separate"/>
       </w:r>
       <w:r>
-        <w:t xml:space="preserve">ER-modellt </w:t>
-      </w:r>
-      <w:r>
-        <w:rPr>
-          <w:vertAlign w:val="subscript"/>
-        </w:rPr>
-        <w:t xml:space="preserve">(ábra </w:t>
+        <w:t xml:space="preserve">ER-modellt (ábra </w:t>
       </w:r>
       <w:r>
         <w:rPr>
           <w:noProof/>
-          <w:vertAlign w:val="subscript"/>
-        </w:rPr>
-        <w:t>1</w:t>
-      </w:r>
-      <w:r>
-        <w:rPr>
-          <w:vertAlign w:val="subscript"/>
-        </w:rPr>
+        </w:rPr>
+        <w:t>2</w:t>
+      </w:r>
+      <w:r>
         <w:t>)</w:t>
       </w:r>
       <w:r>
@@ -3840,25 +4793,15 @@
         <w:fldChar w:fldCharType="separate"/>
       </w:r>
       <w:r>
-        <w:t xml:space="preserve">relációs diagrammot </w:t>
-      </w:r>
-      <w:r>
-        <w:rPr>
-          <w:vertAlign w:val="subscript"/>
-        </w:rPr>
-        <w:t xml:space="preserve">(ábra </w:t>
+        <w:t xml:space="preserve">Relációs diagrammot (ábra </w:t>
       </w:r>
       <w:r>
         <w:rPr>
           <w:noProof/>
-          <w:vertAlign w:val="subscript"/>
-        </w:rPr>
-        <w:t>2</w:t>
-      </w:r>
-      <w:r>
-        <w:rPr>
-          <w:vertAlign w:val="subscript"/>
-        </w:rPr>
+        </w:rPr>
+        <w:t>3</w:t>
+      </w:r>
+      <w:r>
         <w:t>)</w:t>
       </w:r>
       <w:r>
@@ -3873,11 +4816,11 @@
         <w:pStyle w:val="Heading3"/>
         <w:suppressAutoHyphens/>
       </w:pPr>
-      <w:bookmarkStart w:id="11" w:name="_Toc227277587"/>
+      <w:bookmarkStart w:id="16" w:name="_Toc227708713"/>
       <w:r>
         <w:t>Egyedtípusok</w:t>
       </w:r>
-      <w:bookmarkEnd w:id="11"/>
+      <w:bookmarkEnd w:id="16"/>
     </w:p>
     <w:p>
       <w:pPr>
@@ -3901,7 +4844,7 @@
           <w:bCs/>
         </w:rPr>
       </w:pPr>
-      <w:bookmarkStart w:id="12" w:name="_Toc227277588"/>
+      <w:bookmarkStart w:id="17" w:name="_Toc227708714"/>
       <w:r>
         <w:rPr>
           <w:rStyle w:val="Heading4Char"/>
@@ -3928,7 +4871,7 @@
         </w:rPr>
         <w:t>)</w:t>
       </w:r>
-      <w:bookmarkEnd w:id="12"/>
+      <w:bookmarkEnd w:id="17"/>
     </w:p>
     <w:p>
       <w:pPr>
@@ -4501,7 +5444,7 @@
         <w:pStyle w:val="Heading4"/>
         <w:suppressAutoHyphens/>
       </w:pPr>
-      <w:bookmarkStart w:id="13" w:name="_Toc227277589"/>
+      <w:bookmarkStart w:id="18" w:name="_Toc227708715"/>
       <w:r>
         <w:lastRenderedPageBreak/>
         <w:t>Token (</w:t>
@@ -4514,7 +5457,7 @@
       <w:r>
         <w:t>)</w:t>
       </w:r>
-      <w:bookmarkEnd w:id="13"/>
+      <w:bookmarkEnd w:id="18"/>
     </w:p>
     <w:p>
       <w:pPr>
@@ -4716,7 +5659,7 @@
         <w:pStyle w:val="Heading4"/>
         <w:suppressAutoHyphens/>
       </w:pPr>
-      <w:bookmarkStart w:id="14" w:name="_Toc227277590"/>
+      <w:bookmarkStart w:id="19" w:name="_Toc227708716"/>
       <w:r>
         <w:t>Értesítés (</w:t>
       </w:r>
@@ -4728,7 +5671,7 @@
       <w:r>
         <w:t>)</w:t>
       </w:r>
-      <w:bookmarkEnd w:id="14"/>
+      <w:bookmarkEnd w:id="19"/>
     </w:p>
     <w:p>
       <w:pPr>
@@ -4957,7 +5900,7 @@
         <w:pStyle w:val="Heading4"/>
         <w:suppressAutoHyphens/>
       </w:pPr>
-      <w:bookmarkStart w:id="15" w:name="_Toc227277591"/>
+      <w:bookmarkStart w:id="20" w:name="_Toc227708717"/>
       <w:r>
         <w:lastRenderedPageBreak/>
         <w:t>Jármű (</w:t>
@@ -4970,7 +5913,7 @@
       <w:r>
         <w:t>)</w:t>
       </w:r>
-      <w:bookmarkEnd w:id="15"/>
+      <w:bookmarkEnd w:id="20"/>
     </w:p>
     <w:p>
       <w:pPr>
@@ -5540,7 +6483,7 @@
         <w:pStyle w:val="Heading4"/>
         <w:suppressAutoHyphens/>
       </w:pPr>
-      <w:bookmarkStart w:id="16" w:name="_Toc227277592"/>
+      <w:bookmarkStart w:id="21" w:name="_Toc227708718"/>
       <w:r>
         <w:lastRenderedPageBreak/>
         <w:t>Járműelé</w:t>
@@ -5562,7 +6505,7 @@
       <w:r>
         <w:t>)</w:t>
       </w:r>
-      <w:bookmarkEnd w:id="16"/>
+      <w:bookmarkEnd w:id="21"/>
     </w:p>
     <w:p>
       <w:pPr>
@@ -5792,7 +6735,7 @@
         <w:pStyle w:val="Heading4"/>
         <w:suppressAutoHyphens/>
       </w:pPr>
-      <w:bookmarkStart w:id="17" w:name="_Toc227277593"/>
+      <w:bookmarkStart w:id="22" w:name="_Toc227708719"/>
       <w:r>
         <w:t>Járműkép (</w:t>
       </w:r>
@@ -5804,7 +6747,7 @@
       <w:r>
         <w:t>)</w:t>
       </w:r>
-      <w:bookmarkEnd w:id="17"/>
+      <w:bookmarkEnd w:id="22"/>
       <w:r>
         <w:t xml:space="preserve"> </w:t>
       </w:r>
@@ -6032,7 +6975,7 @@
       <w:r>
         <w:br w:type="page"/>
       </w:r>
-      <w:bookmarkStart w:id="18" w:name="_Toc227277594"/>
+      <w:bookmarkStart w:id="23" w:name="_Toc227708720"/>
       <w:r>
         <w:lastRenderedPageBreak/>
         <w:t>Bérlés (</w:t>
@@ -6045,7 +6988,7 @@
       <w:r>
         <w:t>)</w:t>
       </w:r>
-      <w:bookmarkEnd w:id="18"/>
+      <w:bookmarkEnd w:id="23"/>
     </w:p>
     <w:p>
       <w:pPr>
@@ -6668,7 +7611,7 @@
         <w:pStyle w:val="Heading4"/>
         <w:suppressAutoHyphens/>
       </w:pPr>
-      <w:bookmarkStart w:id="19" w:name="_Toc227277595"/>
+      <w:bookmarkStart w:id="24" w:name="_Toc227708721"/>
       <w:r>
         <w:t>Üzenet (</w:t>
       </w:r>
@@ -6680,7 +7623,7 @@
       <w:r>
         <w:t>)</w:t>
       </w:r>
-      <w:bookmarkEnd w:id="19"/>
+      <w:bookmarkEnd w:id="24"/>
     </w:p>
     <w:p>
       <w:pPr>
@@ -6994,12 +7937,12 @@
         <w:pStyle w:val="Heading3"/>
         <w:suppressAutoHyphens/>
       </w:pPr>
-      <w:bookmarkStart w:id="20" w:name="_Toc227277596"/>
+      <w:bookmarkStart w:id="25" w:name="_Toc227708722"/>
       <w:r>
         <w:lastRenderedPageBreak/>
         <w:t>Kapcsolatok</w:t>
       </w:r>
-      <w:bookmarkEnd w:id="20"/>
+      <w:bookmarkEnd w:id="25"/>
     </w:p>
     <w:p>
       <w:pPr>
@@ -7270,11 +8213,11 @@
       <w:pPr>
         <w:pStyle w:val="Heading3"/>
       </w:pPr>
-      <w:bookmarkStart w:id="21" w:name="_Toc227277597"/>
+      <w:bookmarkStart w:id="26" w:name="_Toc227708723"/>
       <w:r>
         <w:t>Implementáció</w:t>
       </w:r>
-      <w:bookmarkEnd w:id="21"/>
+      <w:bookmarkEnd w:id="26"/>
     </w:p>
     <w:p>
       <w:r>
@@ -7305,12 +8248,12 @@
         <w:pStyle w:val="Heading2"/>
         <w:suppressAutoHyphens/>
       </w:pPr>
-      <w:bookmarkStart w:id="22" w:name="_Toc227277598"/>
+      <w:bookmarkStart w:id="27" w:name="_Toc227708724"/>
       <w:r>
         <w:lastRenderedPageBreak/>
         <w:t>Backend</w:t>
       </w:r>
-      <w:bookmarkEnd w:id="22"/>
+      <w:bookmarkEnd w:id="27"/>
     </w:p>
     <w:p>
       <w:pPr>
@@ -7340,22 +8283,22 @@
         <w:pStyle w:val="Heading3"/>
         <w:suppressAutoHyphens/>
       </w:pPr>
-      <w:bookmarkStart w:id="23" w:name="_Toc227277599"/>
+      <w:bookmarkStart w:id="28" w:name="_Toc227708725"/>
       <w:r>
         <w:t>Metóduskontrollerek</w:t>
       </w:r>
-      <w:bookmarkEnd w:id="23"/>
+      <w:bookmarkEnd w:id="28"/>
     </w:p>
     <w:p>
       <w:pPr>
         <w:pStyle w:val="Heading4"/>
         <w:suppressAutoHyphens/>
       </w:pPr>
-      <w:bookmarkStart w:id="24" w:name="_Toc227277600"/>
+      <w:bookmarkStart w:id="29" w:name="_Toc227708726"/>
       <w:r>
         <w:t>Autentikációs kontroller – AuthController</w:t>
       </w:r>
-      <w:bookmarkEnd w:id="24"/>
+      <w:bookmarkEnd w:id="29"/>
     </w:p>
     <w:p>
       <w:pPr>
@@ -8397,12 +9340,12 @@
         <w:pStyle w:val="Heading4"/>
         <w:suppressAutoHyphens/>
       </w:pPr>
-      <w:bookmarkStart w:id="25" w:name="_Toc227277601"/>
+      <w:bookmarkStart w:id="30" w:name="_Toc227708727"/>
       <w:r>
         <w:lastRenderedPageBreak/>
         <w:t>Felhasználó kontroller – UserController</w:t>
       </w:r>
-      <w:bookmarkEnd w:id="25"/>
+      <w:bookmarkEnd w:id="30"/>
     </w:p>
     <w:p>
       <w:pPr>
@@ -10636,7 +11579,7 @@
         <w:pStyle w:val="Heading4"/>
         <w:suppressAutoHyphens/>
       </w:pPr>
-      <w:bookmarkStart w:id="26" w:name="_Toc227277602"/>
+      <w:bookmarkStart w:id="31" w:name="_Toc227708728"/>
       <w:r>
         <w:lastRenderedPageBreak/>
         <w:t xml:space="preserve">Bérlés kontroller – </w:t>
@@ -10645,7 +11588,7 @@
       <w:r>
         <w:t>RentalController</w:t>
       </w:r>
-      <w:bookmarkEnd w:id="26"/>
+      <w:bookmarkEnd w:id="31"/>
       <w:proofErr w:type="spellEnd"/>
     </w:p>
     <w:p>
@@ -12613,12 +13556,12 @@
         <w:pStyle w:val="Heading4"/>
         <w:suppressAutoHyphens/>
       </w:pPr>
-      <w:bookmarkStart w:id="27" w:name="_Toc227277603"/>
+      <w:bookmarkStart w:id="32" w:name="_Toc227708729"/>
       <w:r>
         <w:lastRenderedPageBreak/>
         <w:t>Jármű kontroller – VehicleController</w:t>
       </w:r>
-      <w:bookmarkEnd w:id="27"/>
+      <w:bookmarkEnd w:id="32"/>
     </w:p>
     <w:p>
       <w:pPr>
@@ -17386,12 +18329,12 @@
       <w:pPr>
         <w:pStyle w:val="Heading3"/>
       </w:pPr>
-      <w:bookmarkStart w:id="28" w:name="_Toc227277604"/>
+      <w:bookmarkStart w:id="33" w:name="_Toc227708730"/>
       <w:r>
         <w:lastRenderedPageBreak/>
         <w:t>Szolgáltatások</w:t>
       </w:r>
-      <w:bookmarkEnd w:id="28"/>
+      <w:bookmarkEnd w:id="33"/>
     </w:p>
     <w:p>
       <w:r>
@@ -17402,11 +18345,11 @@
       <w:pPr>
         <w:pStyle w:val="Heading4"/>
       </w:pPr>
-      <w:bookmarkStart w:id="29" w:name="_Toc227277605"/>
+      <w:bookmarkStart w:id="34" w:name="_Toc227708731"/>
       <w:r>
         <w:t>Autentikációs szolgáltatás – AuthService</w:t>
       </w:r>
-      <w:bookmarkEnd w:id="29"/>
+      <w:bookmarkEnd w:id="34"/>
     </w:p>
     <w:p>
       <w:pPr>
@@ -17517,7 +18460,7 @@
       <w:pPr>
         <w:pStyle w:val="Heading4"/>
       </w:pPr>
-      <w:bookmarkStart w:id="30" w:name="_Toc227277606"/>
+      <w:bookmarkStart w:id="35" w:name="_Toc227708732"/>
       <w:r>
         <w:lastRenderedPageBreak/>
         <w:t xml:space="preserve">Email szolgáltatás – IEmailService </w:t>
@@ -17531,7 +18474,7 @@
       <w:r>
         <w:t>ResendEmailService</w:t>
       </w:r>
-      <w:bookmarkEnd w:id="30"/>
+      <w:bookmarkEnd w:id="35"/>
     </w:p>
     <w:p>
       <w:pPr>
@@ -17611,7 +18554,7 @@
         <w:pStyle w:val="Heading4"/>
         <w:spacing w:before="480"/>
       </w:pPr>
-      <w:bookmarkStart w:id="31" w:name="_Toc227277607"/>
+      <w:bookmarkStart w:id="36" w:name="_Toc227708733"/>
       <w:r>
         <w:t>K</w:t>
       </w:r>
@@ -17624,7 +18567,7 @@
       <w:r>
         <w:t xml:space="preserve"> szolgáltatás – IResourceService – LocalResourceService</w:t>
       </w:r>
-      <w:bookmarkEnd w:id="31"/>
+      <w:bookmarkEnd w:id="36"/>
     </w:p>
     <w:p>
       <w:pPr>
@@ -17690,6 +18633,9 @@
         <w:t>(</w:t>
       </w:r>
       <w:r>
+        <w:t xml:space="preserve">vagy </w:t>
+      </w:r>
+      <w:r>
         <w:t xml:space="preserve">opcionálisan más) </w:t>
       </w:r>
       <w:r>
@@ -17715,7 +18661,7 @@
         <w:t xml:space="preserve"> egy</w:t>
       </w:r>
       <w:r>
-        <w:t xml:space="preserve"> olyan mappa, amelyből az ASP.NET backend, statikus fájlok</w:t>
+        <w:t xml:space="preserve"> olyan mappa, amelyből az ASP.NET backend statikus fájlok</w:t>
       </w:r>
       <w:r>
         <w:t xml:space="preserve">at oszt meg, a mi esetünkben a </w:t>
@@ -17750,12 +18696,12 @@
       <w:pPr>
         <w:pStyle w:val="Heading4"/>
       </w:pPr>
-      <w:bookmarkStart w:id="32" w:name="_Toc227277608"/>
+      <w:bookmarkStart w:id="37" w:name="_Toc227708734"/>
       <w:r>
         <w:lastRenderedPageBreak/>
         <w:t>Bérléskezelő szolgáltatás – RentalService</w:t>
       </w:r>
-      <w:bookmarkEnd w:id="32"/>
+      <w:bookmarkEnd w:id="37"/>
     </w:p>
     <w:p>
       <w:r>
@@ -18431,12 +19377,12 @@
       <w:pPr>
         <w:pStyle w:val="Heading3"/>
       </w:pPr>
-      <w:bookmarkStart w:id="33" w:name="_Toc227277609"/>
+      <w:bookmarkStart w:id="38" w:name="_Toc227708735"/>
       <w:r>
         <w:lastRenderedPageBreak/>
         <w:t>Válaszszűrőrendszer – VisibilityFiltering</w:t>
       </w:r>
-      <w:bookmarkEnd w:id="33"/>
+      <w:bookmarkEnd w:id="38"/>
     </w:p>
     <w:p>
       <w:r>
@@ -18738,12 +19684,12 @@
           <w:bCs/>
         </w:rPr>
       </w:pPr>
-      <w:bookmarkStart w:id="34" w:name="_Toc227277610"/>
+      <w:bookmarkStart w:id="39" w:name="_Toc227708736"/>
       <w:r>
         <w:lastRenderedPageBreak/>
         <w:t>Működésének műszaki feltételei</w:t>
       </w:r>
-      <w:bookmarkEnd w:id="34"/>
+      <w:bookmarkEnd w:id="39"/>
     </w:p>
     <w:p>
       <w:pPr>
@@ -18774,7 +19720,7 @@
           <w:szCs w:val="22"/>
         </w:rPr>
       </w:pPr>
-      <w:bookmarkStart w:id="35" w:name="_Toc227277611"/>
+      <w:bookmarkStart w:id="40" w:name="_Toc227708737"/>
       <w:r>
         <w:lastRenderedPageBreak/>
         <w:t>Használatának rövid bemutatás</w:t>
@@ -18782,7 +19728,7 @@
       <w:r>
         <w:t>a</w:t>
       </w:r>
-      <w:bookmarkEnd w:id="35"/>
+      <w:bookmarkEnd w:id="40"/>
     </w:p>
     <w:p>
       <w:pPr>
@@ -18801,12 +19747,12 @@
         <w:pStyle w:val="Heading1"/>
         <w:suppressAutoHyphens/>
       </w:pPr>
-      <w:bookmarkStart w:id="36" w:name="_Toc227277612"/>
+      <w:bookmarkStart w:id="41" w:name="_Toc227708738"/>
       <w:r>
         <w:lastRenderedPageBreak/>
         <w:t>Továbbfejlesztési lehetőségek</w:t>
       </w:r>
-      <w:bookmarkEnd w:id="36"/>
+      <w:bookmarkEnd w:id="41"/>
     </w:p>
     <w:p>
       <w:pPr>
@@ -18907,10 +19853,48 @@
     </w:p>
     <w:p>
       <w:pPr>
+        <w:pStyle w:val="ListParagraph"/>
+        <w:numPr>
+          <w:ilvl w:val="0"/>
+          <w:numId w:val="28"/>
+        </w:numPr>
+        <w:suppressAutoHyphens/>
         <w:spacing w:after="160" w:line="259" w:lineRule="auto"/>
         <w:jc w:val="left"/>
       </w:pPr>
       <w:r>
+        <w:rPr>
+          <w:b/>
+          <w:bCs/>
+        </w:rPr>
+        <w:t>QR-kódos átadás/átvétel megerősítés</w:t>
+      </w:r>
+    </w:p>
+    <w:p>
+      <w:pPr>
+        <w:pStyle w:val="ListParagraph"/>
+        <w:numPr>
+          <w:ilvl w:val="0"/>
+          <w:numId w:val="28"/>
+        </w:numPr>
+        <w:suppressAutoHyphens/>
+        <w:spacing w:after="160" w:line="259" w:lineRule="auto"/>
+        <w:jc w:val="left"/>
+      </w:pPr>
+      <w:r>
+        <w:rPr>
+          <w:b/>
+          <w:bCs/>
+        </w:rPr>
+        <w:t>Szöveges értékelések</w:t>
+      </w:r>
+    </w:p>
+    <w:p>
+      <w:pPr>
+        <w:spacing w:after="160" w:line="259" w:lineRule="auto"/>
+        <w:jc w:val="left"/>
+      </w:pPr>
+      <w:r>
         <w:br w:type="page"/>
       </w:r>
     </w:p>
@@ -18918,10 +19902,12 @@
       <w:pPr>
         <w:pStyle w:val="Heading1"/>
       </w:pPr>
+      <w:bookmarkStart w:id="42" w:name="_Toc227708739"/>
       <w:r>
         <w:lastRenderedPageBreak/>
         <w:t>Tesztdokumentáció</w:t>
       </w:r>
+      <w:bookmarkEnd w:id="42"/>
     </w:p>
     <w:p>
       <w:r>
@@ -18945,9 +19931,11 @@
       <w:pPr>
         <w:pStyle w:val="Heading2"/>
       </w:pPr>
+      <w:bookmarkStart w:id="43" w:name="_Toc227708740"/>
       <w:r>
         <w:t>TestHandler</w:t>
       </w:r>
+      <w:bookmarkEnd w:id="43"/>
     </w:p>
     <w:p>
       <w:r>
@@ -19073,6 +20061,67 @@
       <w:pPr>
         <w:pStyle w:val="Heading2"/>
       </w:pPr>
+      <w:bookmarkStart w:id="44" w:name="_Toc227708741"/>
+      <w:r>
+        <w:rPr>
+          <w:noProof/>
+        </w:rPr>
+        <w:drawing>
+          <wp:anchor distT="0" distB="0" distL="114300" distR="114300" simplePos="0" relativeHeight="251661312" behindDoc="0" locked="0" layoutInCell="1" allowOverlap="1" wp14:anchorId="735B15A6" wp14:editId="7105C141">
+            <wp:simplePos x="0" y="0"/>
+            <wp:positionH relativeFrom="column">
+              <wp:posOffset>2659380</wp:posOffset>
+            </wp:positionH>
+            <wp:positionV relativeFrom="paragraph">
+              <wp:posOffset>61595</wp:posOffset>
+            </wp:positionV>
+            <wp:extent cx="3140075" cy="2342515"/>
+            <wp:effectExtent l="0" t="0" r="0" b="0"/>
+            <wp:wrapSquare wrapText="bothSides"/>
+            <wp:docPr id="411253946" name="Picture 3" descr="A screenshot of a computer&#10;&#10;AI-generated content may be incorrect."/>
+            <wp:cNvGraphicFramePr>
+              <a:graphicFrameLocks xmlns:a="http://schemas.openxmlformats.org/drawingml/2006/main" noChangeAspect="1"/>
+            </wp:cNvGraphicFramePr>
+            <a:graphic xmlns:a="http://schemas.openxmlformats.org/drawingml/2006/main">
+              <a:graphicData uri="http://schemas.openxmlformats.org/drawingml/2006/picture">
+                <pic:pic xmlns:pic="http://schemas.openxmlformats.org/drawingml/2006/picture">
+                  <pic:nvPicPr>
+                    <pic:cNvPr id="411253946" name="Picture 3" descr="A screenshot of a computer&#10;&#10;AI-generated content may be incorrect."/>
+                    <pic:cNvPicPr/>
+                  </pic:nvPicPr>
+                  <pic:blipFill>
+                    <a:blip r:embed="rId11" cstate="print">
+                      <a:extLst>
+                        <a:ext uri="{28A0092B-C50C-407E-A947-70E740481C1C}">
+                          <a14:useLocalDpi xmlns:a14="http://schemas.microsoft.com/office/drawing/2010/main" val="0"/>
+                        </a:ext>
+                      </a:extLst>
+                    </a:blip>
+                    <a:stretch>
+                      <a:fillRect/>
+                    </a:stretch>
+                  </pic:blipFill>
+                  <pic:spPr>
+                    <a:xfrm>
+                      <a:off x="0" y="0"/>
+                      <a:ext cx="3140075" cy="2342515"/>
+                    </a:xfrm>
+                    <a:prstGeom prst="rect">
+                      <a:avLst/>
+                    </a:prstGeom>
+                  </pic:spPr>
+                </pic:pic>
+              </a:graphicData>
+            </a:graphic>
+            <wp14:sizeRelH relativeFrom="page">
+              <wp14:pctWidth>0</wp14:pctWidth>
+            </wp14:sizeRelH>
+            <wp14:sizeRelV relativeFrom="page">
+              <wp14:pctHeight>0</wp14:pctHeight>
+            </wp14:sizeRelV>
+          </wp:anchor>
+        </w:drawing>
+      </w:r>
       <w:r>
         <w:t>Kontroller metódusok</w:t>
       </w:r>
@@ -19082,6 +20131,7 @@
       <w:r>
         <w:t>elése</w:t>
       </w:r>
+      <w:bookmarkEnd w:id="44"/>
     </w:p>
     <w:p>
       <w:r>
@@ -19123,6 +20173,140 @@
       </w:pPr>
       <w:r>
         <w:rPr>
+          <w:noProof/>
+        </w:rPr>
+        <mc:AlternateContent>
+          <mc:Choice Requires="wps">
+            <w:drawing>
+              <wp:anchor distT="0" distB="0" distL="114300" distR="114300" simplePos="0" relativeHeight="251663360" behindDoc="0" locked="0" layoutInCell="1" allowOverlap="1" wp14:anchorId="3BF47D0F" wp14:editId="4C34522E">
+                <wp:simplePos x="0" y="0"/>
+                <wp:positionH relativeFrom="column">
+                  <wp:posOffset>2858135</wp:posOffset>
+                </wp:positionH>
+                <wp:positionV relativeFrom="paragraph">
+                  <wp:posOffset>266527</wp:posOffset>
+                </wp:positionV>
+                <wp:extent cx="2747645" cy="192405"/>
+                <wp:effectExtent l="0" t="0" r="8255" b="10795"/>
+                <wp:wrapSquare wrapText="bothSides"/>
+                <wp:docPr id="2057173447" name="Text Box 1"/>
+                <wp:cNvGraphicFramePr/>
+                <a:graphic xmlns:a="http://schemas.openxmlformats.org/drawingml/2006/main">
+                  <a:graphicData uri="http://schemas.microsoft.com/office/word/2010/wordprocessingShape">
+                    <wps:wsp>
+                      <wps:cNvSpPr txBox="1"/>
+                      <wps:spPr>
+                        <a:xfrm>
+                          <a:off x="0" y="0"/>
+                          <a:ext cx="2747645" cy="192405"/>
+                        </a:xfrm>
+                        <a:prstGeom prst="rect">
+                          <a:avLst/>
+                        </a:prstGeom>
+                        <a:noFill/>
+                        <a:ln>
+                          <a:noFill/>
+                        </a:ln>
+                      </wps:spPr>
+                      <wps:txbx>
+                        <w:txbxContent>
+                          <w:p>
+                            <w:pPr>
+                              <w:pStyle w:val="Caption"/>
+                              <w:rPr>
+                                <w:b/>
+                                <w:noProof/>
+                                <w:color w:val="auto"/>
+                                <w:sz w:val="28"/>
+                                <w:szCs w:val="26"/>
+                              </w:rPr>
+                            </w:pPr>
+                            <w:r>
+                              <w:t>Sikeres tesztesetek (</w:t>
+                            </w:r>
+                            <w:r>
+                              <w:t xml:space="preserve">ábra </w:t>
+                            </w:r>
+                            <w:fldSimple w:instr=" SEQ ábra \* ARABIC ">
+                              <w:r>
+                                <w:rPr>
+                                  <w:noProof/>
+                                </w:rPr>
+                                <w:t>1</w:t>
+                              </w:r>
+                            </w:fldSimple>
+                            <w:r>
+                              <w:t>)</w:t>
+                            </w:r>
+                          </w:p>
+                        </w:txbxContent>
+                      </wps:txbx>
+                      <wps:bodyPr rot="0" spcFirstLastPara="0" vertOverflow="overflow" horzOverflow="overflow" vert="horz" wrap="square" lIns="0" tIns="0" rIns="0" bIns="0" numCol="1" spcCol="0" rtlCol="0" fromWordArt="0" anchor="t" anchorCtr="0" forceAA="0" compatLnSpc="1">
+                        <a:prstTxWarp prst="textNoShape">
+                          <a:avLst/>
+                        </a:prstTxWarp>
+                        <a:noAutofit/>
+                      </wps:bodyPr>
+                    </wps:wsp>
+                  </a:graphicData>
+                </a:graphic>
+                <wp14:sizeRelH relativeFrom="margin">
+                  <wp14:pctWidth>0</wp14:pctWidth>
+                </wp14:sizeRelH>
+                <wp14:sizeRelV relativeFrom="margin">
+                  <wp14:pctHeight>0</wp14:pctHeight>
+                </wp14:sizeRelV>
+              </wp:anchor>
+            </w:drawing>
+          </mc:Choice>
+          <mc:Fallback>
+            <w:pict>
+              <v:shapetype w14:anchorId="3BF47D0F" id="_x0000_t202" coordsize="21600,21600" o:spt="202" path="m,l,21600r21600,l21600,xe">
+                <v:stroke joinstyle="miter"/>
+                <v:path gradientshapeok="t" o:connecttype="rect"/>
+              </v:shapetype>
+              <v:shape id="Text Box 1" o:spid="_x0000_s1026" type="#_x0000_t202" style="position:absolute;left:0;text-align:left;margin-left:225.05pt;margin-top:21pt;width:216.35pt;height:15.15pt;z-index:251663360;visibility:visible;mso-wrap-style:square;mso-width-percent:0;mso-height-percent:0;mso-wrap-distance-left:9pt;mso-wrap-distance-top:0;mso-wrap-distance-right:9pt;mso-wrap-distance-bottom:0;mso-position-horizontal:absolute;mso-position-horizontal-relative:text;mso-position-vertical:absolute;mso-position-vertical-relative:text;mso-width-percent:0;mso-height-percent:0;mso-width-relative:margin;mso-height-relative:margin;v-text-anchor:top" o:gfxdata="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" filled="f" stroked="f">
+                <v:textbox inset="0,0,0,0">
+                  <w:txbxContent>
+                    <w:p>
+                      <w:pPr>
+                        <w:pStyle w:val="Caption"/>
+                        <w:rPr>
+                          <w:b/>
+                          <w:noProof/>
+                          <w:color w:val="auto"/>
+                          <w:sz w:val="28"/>
+                          <w:szCs w:val="26"/>
+                        </w:rPr>
+                      </w:pPr>
+                      <w:r>
+                        <w:t>Sikeres tesztesetek (</w:t>
+                      </w:r>
+                      <w:r>
+                        <w:t xml:space="preserve">ábra </w:t>
+                      </w:r>
+                      <w:fldSimple w:instr=" SEQ ábra \* ARABIC ">
+                        <w:r>
+                          <w:rPr>
+                            <w:noProof/>
+                          </w:rPr>
+                          <w:t>1</w:t>
+                        </w:r>
+                      </w:fldSimple>
+                      <w:r>
+                        <w:t>)</w:t>
+                      </w:r>
+                    </w:p>
+                  </w:txbxContent>
+                </v:textbox>
+                <w10:wrap type="square"/>
+              </v:shape>
+            </w:pict>
+          </mc:Fallback>
+        </mc:AlternateContent>
+      </w:r>
+      <w:r>
+        <w:rPr>
           <w:b/>
           <w:bCs/>
         </w:rPr>
@@ -19165,16 +20349,223 @@
       <w:r>
         <w:t>, a járművek adatainak, elérhetőségeinek, képeinek feltöltését, lekérését, módosítását és törlését teszteli, figyeli a bejelentkezett felhasználó alapján a válaszszűrést is.</w:t>
       </w:r>
-      <w:r>
+    </w:p>
+    <w:p>
+      <w:pPr>
+        <w:pStyle w:val="ListParagraph"/>
+        <w:numPr>
+          <w:ilvl w:val="0"/>
+          <w:numId w:val="30"/>
+        </w:numPr>
+      </w:pPr>
+      <w:r>
+        <w:rPr>
+          <w:b/>
+          <w:bCs/>
+        </w:rPr>
+        <w:t xml:space="preserve">RentalControllerTests: </w:t>
+      </w:r>
+      <w:r>
+        <w:t xml:space="preserve">A RentalContoller metódusait teszteli, </w:t>
+      </w:r>
+      <w:r>
+        <w:t>ezáltal pedig</w:t>
+      </w:r>
+      <w:r>
+        <w:t xml:space="preserve"> az állapotkezelő rendszert.</w:t>
+      </w:r>
+    </w:p>
+    <w:p>
+      <w:pPr>
+        <w:spacing w:after="160" w:line="259" w:lineRule="auto"/>
+        <w:jc w:val="left"/>
+        <w:rPr>
+          <w:b/>
+          <w:bCs/>
+        </w:rPr>
+      </w:pPr>
+      <w:r>
+        <w:rPr>
+          <w:b/>
+          <w:bCs/>
+        </w:rPr>
         <w:br w:type="page"/>
       </w:r>
     </w:p>
     <w:p>
       <w:pPr>
+        <w:pStyle w:val="Heading2"/>
+      </w:pPr>
+      <w:bookmarkStart w:id="45" w:name="_Toc227708742"/>
+      <w:r>
+        <w:lastRenderedPageBreak/>
+        <w:t>Stressztesztelés</w:t>
+      </w:r>
+      <w:bookmarkEnd w:id="45"/>
+    </w:p>
+    <w:p>
+      <w:r>
+        <w:t xml:space="preserve">Az egységtesztek mellett teszteltük az API válaszidejét stresszteszteléssel. Ehhez a </w:t>
+      </w:r>
+      <w:r>
+        <w:rPr>
+          <w:b/>
+          <w:bCs/>
+        </w:rPr>
+        <w:t>Locust</w:t>
+      </w:r>
+      <w:r>
+        <w:t xml:space="preserve"> nevű </w:t>
+      </w:r>
+      <w:r>
+        <w:t>Python</w:t>
+      </w:r>
+      <w:r>
+        <w:t xml:space="preserve"> csomagot használtuk, amit a </w:t>
+      </w:r>
+      <w:r>
+        <w:rPr>
+          <w:lang w:val="en-US"/>
+        </w:rPr>
+        <w:t>P</w:t>
+      </w:r>
+      <w:r>
+        <w:rPr>
+          <w:lang w:val="en-US"/>
+        </w:rPr>
+        <w:t xml:space="preserve">ython </w:t>
+      </w:r>
+      <w:proofErr w:type="spellStart"/>
+      <w:r>
+        <w:rPr>
+          <w:lang w:val="en-US"/>
+        </w:rPr>
+        <w:t>csomagkezel</w:t>
+      </w:r>
+      <w:r>
+        <w:t>őjéve</w:t>
+      </w:r>
+      <w:r>
+        <w:t>l</w:t>
+      </w:r>
+      <w:proofErr w:type="spellEnd"/>
+      <w:r>
+        <w:t xml:space="preserve"> lehet telepíteni, a pip-pel</w:t>
+      </w:r>
+      <w:r>
+        <w:t xml:space="preserve">: </w:t>
+      </w:r>
+      <w:r>
+        <w:rPr>
+          <w:i/>
+          <w:iCs/>
+          <w:u w:val="single"/>
+        </w:rPr>
+        <w:t>pip install locust</w:t>
+      </w:r>
+      <w:r>
+        <w:t>.</w:t>
+      </w:r>
+    </w:p>
+    <w:p>
+      <w:r>
+        <w:t xml:space="preserve">A stresszteszt elindításához először el kell indítanunk a backend-et </w:t>
+      </w:r>
+      <w:r>
+        <w:rPr>
+          <w:b/>
+          <w:bCs/>
+        </w:rPr>
+        <w:t>http</w:t>
+      </w:r>
+      <w:r>
+        <w:t xml:space="preserve"> módban</w:t>
+      </w:r>
+      <w:r>
+        <w:t xml:space="preserve">, másképp, mivel a locust nem ismeri fel a backend SSL </w:t>
+      </w:r>
+      <w:r>
+        <w:t>tanúsítványát</w:t>
+      </w:r>
+      <w:r>
+        <w:t>, minden mért adat hibás lesz</w:t>
+      </w:r>
+      <w:r>
+        <w:t>.</w:t>
+      </w:r>
+    </w:p>
+    <w:p>
+      <w:r>
+        <w:t>Miután a backend fut,</w:t>
+      </w:r>
+      <w:r>
+        <w:t xml:space="preserve"> lépjünk be a </w:t>
+      </w:r>
+      <w:r>
+        <w:rPr>
+          <w:b/>
+          <w:bCs/>
+          <w:i/>
+          <w:iCs/>
+        </w:rPr>
+        <w:t>loadtest/</w:t>
+      </w:r>
+      <w:r>
+        <w:t xml:space="preserve"> mappába és adjuk ki a </w:t>
+      </w:r>
+      <w:r>
+        <w:rPr>
+          <w:i/>
+          <w:iCs/>
+          <w:u w:val="single"/>
+        </w:rPr>
+        <w:t>locust</w:t>
+      </w:r>
+      <w:r>
+        <w:t xml:space="preserve"> parancsot, majd nyissuk meg a böngészőnkben a program által megadott oldalt, és kezdjük meg a </w:t>
+      </w:r>
+      <w:r>
+        <w:t>tesztet</w:t>
+      </w:r>
+      <w:r>
+        <w:t>.</w:t>
+      </w:r>
+    </w:p>
+    <w:p>
+      <w:r>
+        <w:t>Természetesen a stresszteszt korlátozva van abból a szempontból, hogy a backend</w:t>
+      </w:r>
+      <w:r>
+        <w:t xml:space="preserve"> lehet</w:t>
+      </w:r>
+      <w:r>
+        <w:t xml:space="preserve"> képes lenne</w:t>
+      </w:r>
+      <w:r>
+        <w:t xml:space="preserve"> párhuzamosan</w:t>
+      </w:r>
+      <w:r>
+        <w:t xml:space="preserve"> több kérést is kezelni, </w:t>
+      </w:r>
+      <w:r>
+        <w:t>viszont az adatbázis nem</w:t>
+      </w:r>
+      <w:r>
+        <w:t xml:space="preserve"> biztos</w:t>
+      </w:r>
+      <w:r>
+        <w:t>.</w:t>
+      </w:r>
+      <w:r>
+        <w:br w:type="page"/>
+      </w:r>
+    </w:p>
+    <w:p>
+      <w:pPr>
         <w:pStyle w:val="Heading1"/>
         <w:suppressAutoHyphens/>
         <w:sectPr>
-          <w:footerReference w:type="first" r:id="rId11"/>
+          <w:footerReference w:type="first" r:id="rId12"/>
           <w:pgSz w:w="11906" w:h="16838"/>
           <w:pgMar w:top="1418" w:right="1418" w:bottom="1418" w:left="1418" w:header="709" w:footer="709" w:gutter="284"/>
           <w:pgNumType w:start="1"/>
@@ -19188,23 +20579,23 @@
       <w:pPr>
         <w:pStyle w:val="Heading1"/>
       </w:pPr>
-      <w:bookmarkStart w:id="37" w:name="_Toc227277613"/>
+      <w:bookmarkStart w:id="46" w:name="_Toc227708743"/>
       <w:r>
         <w:lastRenderedPageBreak/>
         <w:t>Mellékletek</w:t>
       </w:r>
-      <w:bookmarkEnd w:id="37"/>
+      <w:bookmarkEnd w:id="46"/>
     </w:p>
     <w:p>
       <w:pPr>
         <w:pStyle w:val="Heading2"/>
         <w:suppressAutoHyphens/>
       </w:pPr>
-      <w:bookmarkStart w:id="38" w:name="_Toc227277614"/>
+      <w:bookmarkStart w:id="47" w:name="_Toc227708744"/>
       <w:r>
         <w:t>ER-modell</w:t>
       </w:r>
-      <w:bookmarkEnd w:id="38"/>
+      <w:bookmarkEnd w:id="47"/>
     </w:p>
     <w:p>
       <w:pPr>
@@ -19231,7 +20622,7 @@
                     <pic:cNvPicPr/>
                   </pic:nvPicPr>
                   <pic:blipFill>
-                    <a:blip r:embed="rId12" cstate="print">
+                    <a:blip r:embed="rId13" cstate="print">
                       <a:extLst>
                         <a:ext uri="{28A0092B-C50C-407E-A947-70E740481C1C}">
                           <a14:useLocalDpi xmlns:a14="http://schemas.microsoft.com/office/drawing/2010/main" val="0"/>
@@ -19263,13 +20654,13 @@
         <w:pStyle w:val="Caption"/>
         <w:suppressAutoHyphens/>
       </w:pPr>
-      <w:bookmarkStart w:id="39" w:name="_Ref227153026"/>
-      <w:bookmarkStart w:id="40" w:name="_Ref227152952"/>
-      <w:bookmarkStart w:id="41" w:name="_Ref227153209"/>
+      <w:bookmarkStart w:id="48" w:name="_Ref227153209"/>
+      <w:bookmarkStart w:id="49" w:name="_Ref227153026"/>
+      <w:bookmarkStart w:id="50" w:name="_Ref227152952"/>
       <w:r>
         <w:t>ER-modell</w:t>
       </w:r>
-      <w:bookmarkEnd w:id="39"/>
+      <w:bookmarkEnd w:id="49"/>
       <w:r>
         <w:t xml:space="preserve"> </w:t>
       </w:r>
@@ -19281,21 +20672,21 @@
           <w:rPr>
             <w:noProof/>
           </w:rPr>
-          <w:t>1</w:t>
+          <w:t>2</w:t>
         </w:r>
       </w:fldSimple>
-      <w:bookmarkEnd w:id="40"/>
+      <w:bookmarkEnd w:id="50"/>
       <w:r>
         <w:t>)</w:t>
       </w:r>
-      <w:bookmarkEnd w:id="41"/>
+      <w:bookmarkEnd w:id="48"/>
     </w:p>
     <w:p>
       <w:pPr>
         <w:pStyle w:val="Heading2"/>
         <w:suppressAutoHyphens/>
       </w:pPr>
-      <w:bookmarkStart w:id="42" w:name="_Toc227277615"/>
+      <w:bookmarkStart w:id="51" w:name="_Toc227708745"/>
       <w:r>
         <w:rPr>
           <w:noProof/>
@@ -19325,7 +20716,7 @@
                     <pic:cNvPicPr/>
                   </pic:nvPicPr>
                   <pic:blipFill>
-                    <a:blip r:embed="rId13" cstate="print">
+                    <a:blip r:embed="rId14" cstate="print">
                       <a:extLst>
                         <a:ext uri="{28A0092B-C50C-407E-A947-70E740481C1C}">
                           <a14:useLocalDpi xmlns:a14="http://schemas.microsoft.com/office/drawing/2010/main" val="0"/>
@@ -19409,7 +20800,7 @@
                                 <w:szCs w:val="32"/>
                               </w:rPr>
                             </w:pPr>
-                            <w:bookmarkStart w:id="43" w:name="_Ref227153376"/>
+                            <w:bookmarkStart w:id="52" w:name="_Ref227153376"/>
                             <w:r>
                               <w:t xml:space="preserve">Relációs diagramm (ábra </w:t>
                             </w:r>
@@ -19418,13 +20809,13 @@
                                 <w:rPr>
                                   <w:noProof/>
                                 </w:rPr>
-                                <w:t>2</w:t>
+                                <w:t>3</w:t>
                               </w:r>
                             </w:fldSimple>
                             <w:r>
                               <w:t>)</w:t>
                             </w:r>
-                            <w:bookmarkEnd w:id="43"/>
+                            <w:bookmarkEnd w:id="52"/>
                           </w:p>
                         </w:txbxContent>
                       </wps:txbx>
@@ -19442,11 +20833,7 @@
           </mc:Choice>
           <mc:Fallback>
             <w:pict>
-              <v:shapetype w14:anchorId="2C084721" id="_x0000_t202" coordsize="21600,21600" o:spt="202" path="m,l,21600r21600,l21600,xe">
-                <v:stroke joinstyle="miter"/>
-                <v:path gradientshapeok="t" o:connecttype="rect"/>
-              </v:shapetype>
-              <v:shape id="Text Box 1" o:spid="_x0000_s1026" type="#_x0000_t202" style="position:absolute;margin-left:68.25pt;margin-top:417.75pt;width:564.8pt;height:.05pt;z-index:251660288;visibility:visible;mso-wrap-style:square;mso-wrap-distance-left:9pt;mso-wrap-distance-top:0;mso-wrap-distance-right:9pt;mso-wrap-distance-bottom:0;mso-position-horizontal:absolute;mso-position-horizontal-relative:text;mso-position-vertical:absolute;mso-position-vertical-relative:text;v-text-anchor:top" o:gfxdata="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" stroked="f">
+              <v:shape w14:anchorId="2C084721" id="_x0000_s1027" type="#_x0000_t202" style="position:absolute;margin-left:68.25pt;margin-top:417.75pt;width:564.8pt;height:.05pt;z-index:251660288;visibility:visible;mso-wrap-style:square;mso-wrap-distance-left:9pt;mso-wrap-distance-top:0;mso-wrap-distance-right:9pt;mso-wrap-distance-bottom:0;mso-position-horizontal:absolute;mso-position-horizontal-relative:text;mso-position-vertical:absolute;mso-position-vertical-relative:text;v-text-anchor:top" o:gfxdata="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" stroked="f">
                 <v:textbox style="mso-fit-shape-to-text:t" inset="0,0,0,0">
                   <w:txbxContent>
                     <w:p>
@@ -19460,7 +20847,7 @@
                           <w:szCs w:val="32"/>
                         </w:rPr>
                       </w:pPr>
-                      <w:bookmarkStart w:id="44" w:name="_Ref227153376"/>
+                      <w:bookmarkStart w:id="53" w:name="_Ref227153376"/>
                       <w:r>
                         <w:t xml:space="preserve">Relációs diagramm (ábra </w:t>
                       </w:r>
@@ -19469,13 +20856,13 @@
                           <w:rPr>
                             <w:noProof/>
                           </w:rPr>
-                          <w:t>2</w:t>
+                          <w:t>3</w:t>
                         </w:r>
                       </w:fldSimple>
                       <w:r>
                         <w:t>)</w:t>
                       </w:r>
-                      <w:bookmarkEnd w:id="44"/>
+                      <w:bookmarkEnd w:id="53"/>
                     </w:p>
                   </w:txbxContent>
                 </v:textbox>
@@ -19488,7 +20875,7 @@
       <w:r>
         <w:t>Relációs diagramm</w:t>
       </w:r>
-      <w:bookmarkEnd w:id="42"/>
+      <w:bookmarkEnd w:id="51"/>
     </w:p>
     <w:sectPr>
       <w:pgSz w:w="16838" w:h="11906" w:orient="landscape"/>

</xml_diff>

<commit_message>
uj login + regisztracio
</commit_message>
<xml_diff>
--- a/docs/CoMove szoftveralkalmazás dokumentációja.docx
+++ b/docs/CoMove szoftveralkalmazás dokumentációja.docx
@@ -4285,7 +4285,25 @@
         <w:t xml:space="preserve"> a My</w:t>
       </w:r>
       <w:r>
-        <w:t xml:space="preserve">SQL szerver a 3306-os porton fut, azonban a backend azt a 3307-es porton várja, </w:t>
+        <w:t xml:space="preserve">SQL szerver a </w:t>
+      </w:r>
+      <w:r>
+        <w:rPr>
+          <w:b/>
+        </w:rPr>
+        <w:t>3306</w:t>
+      </w:r>
+      <w:r>
+        <w:t xml:space="preserve">-os porton fut, azonban a backend azt a </w:t>
+      </w:r>
+      <w:r>
+        <w:rPr>
+          <w:b/>
+        </w:rPr>
+        <w:t>3307</w:t>
+      </w:r>
+      <w:r>
+        <w:t xml:space="preserve">-es porton várja, </w:t>
       </w:r>
       <w:r>
         <w:t>így</w:t>
@@ -4442,15 +4460,7 @@
         <w:t>a változtatások szerint</w:t>
       </w:r>
       <w:r>
-        <w:t xml:space="preserve"> kell módosítani a HttpOnly </w:t>
-      </w:r>
-      <w:proofErr w:type="gramStart"/>
-      <w:r>
-        <w:t>sütik</w:t>
-      </w:r>
-      <w:proofErr w:type="gramEnd"/>
-      <w:r>
-        <w:t xml:space="preserve"> beállításait.</w:t>
+        <w:t xml:space="preserve"> kell módosítani a HttpOnly sütik beállításait.</w:t>
       </w:r>
     </w:p>
     <w:p>
@@ -11874,7 +11884,13 @@
         <w:t>nincs megadva átvételi hely</w:t>
       </w:r>
       <w:r>
-        <w:t>, vagy az ajánlatot tevő felhasználónak nem elegendő az egyenlege.</w:t>
+        <w:t xml:space="preserve">, </w:t>
+      </w:r>
+      <w:r>
+        <w:t xml:space="preserve">a felhasználó fiókjában nincs beállítva jogosítványszám </w:t>
+      </w:r>
+      <w:r>
+        <w:t>vagy az ajánlatot tevő felhasználónak nem elegendő az egyenlege.</w:t>
       </w:r>
     </w:p>
     <w:p>
@@ -11933,10 +11949,10 @@
         <w:t xml:space="preserve"> </w:t>
       </w:r>
       <w:r>
-        <w:t>Nincs megadva a felhasználó fiókjában jogosítványszám,</w:t>
-      </w:r>
-      <w:r>
-        <w:t xml:space="preserve"> vagy a felhasználó</w:t>
+        <w:t xml:space="preserve">A </w:t>
+      </w:r>
+      <w:r>
+        <w:t>felhasználó</w:t>
       </w:r>
       <w:r>
         <w:t xml:space="preserve"> a saját </w:t>
@@ -13627,7 +13643,13 @@
         <w:suppressAutoHyphens/>
       </w:pPr>
       <w:r>
-        <w:t>Visszaadja a járműveket szűrve a megadott értékek alapján.</w:t>
+        <w:t>Visszaadja a</w:t>
+      </w:r>
+      <w:r>
+        <w:t xml:space="preserve"> (legalább egy elérhetőséggel rendelkező)</w:t>
+      </w:r>
+      <w:r>
+        <w:t xml:space="preserve"> járműveket szűrve a megadott értékek alapján.</w:t>
       </w:r>
     </w:p>
     <w:p>
@@ -13893,21 +13915,12 @@
         </w:numPr>
         <w:suppressAutoHyphens/>
       </w:pPr>
-      <w:proofErr w:type="spellStart"/>
-      <w:r>
-        <w:rPr>
-          <w:b/>
-          <w:bCs/>
-        </w:rPr>
-        <w:t>minPrice</w:t>
-      </w:r>
-      <w:proofErr w:type="spellEnd"/>
-      <w:r>
-        <w:rPr>
-          <w:b/>
-          <w:bCs/>
-        </w:rPr>
-        <w:t xml:space="preserve"> (opcionális, int):</w:t>
+      <w:r>
+        <w:rPr>
+          <w:b/>
+          <w:bCs/>
+        </w:rPr>
+        <w:t>minPrice (opcionális, int):</w:t>
       </w:r>
       <w:r>
         <w:t xml:space="preserve"> A legkisebb teljes ár, amit a felhasználó kifizetne egy bérlésért.</w:t>
@@ -20685,7 +20698,7 @@
           <w:noProof/>
         </w:rPr>
         <w:drawing>
-          <wp:anchor distT="0" distB="0" distL="114300" distR="114300" simplePos="0" relativeHeight="251664384" behindDoc="0" locked="0" layoutInCell="1" allowOverlap="1" wp14:anchorId="74A491E3" wp14:editId="1F30F296">
+          <wp:anchor distT="0" distB="0" distL="114300" distR="114300" simplePos="0" relativeHeight="251664384" behindDoc="0" locked="0" layoutInCell="1" allowOverlap="1" wp14:anchorId="74A491E3" wp14:editId="1AEF4AE4">
             <wp:simplePos x="0" y="0"/>
             <wp:positionH relativeFrom="column">
               <wp:posOffset>3810</wp:posOffset>
@@ -24584,94 +24597,94 @@
       </w:rPr>
     </w:lvl>
   </w:abstractNum>
-  <w:num w:numId="1" w16cid:durableId="537855090">
+  <w:num w:numId="1" w16cid:durableId="345451344">
     <w:abstractNumId w:val="20"/>
   </w:num>
-  <w:num w:numId="2" w16cid:durableId="2001494564">
+  <w:num w:numId="2" w16cid:durableId="2084913582">
     <w:abstractNumId w:val="2"/>
   </w:num>
-  <w:num w:numId="3" w16cid:durableId="486673559">
+  <w:num w:numId="3" w16cid:durableId="1527139842">
     <w:abstractNumId w:val="4"/>
   </w:num>
-  <w:num w:numId="4" w16cid:durableId="42415547">
+  <w:num w:numId="4" w16cid:durableId="1449006588">
     <w:abstractNumId w:val="6"/>
   </w:num>
-  <w:num w:numId="5" w16cid:durableId="1700622790">
+  <w:num w:numId="5" w16cid:durableId="1839736531">
     <w:abstractNumId w:val="7"/>
   </w:num>
-  <w:num w:numId="6" w16cid:durableId="1383169143">
+  <w:num w:numId="6" w16cid:durableId="249315690">
     <w:abstractNumId w:val="13"/>
   </w:num>
-  <w:num w:numId="7" w16cid:durableId="294408398">
+  <w:num w:numId="7" w16cid:durableId="1285381993">
     <w:abstractNumId w:val="28"/>
   </w:num>
-  <w:num w:numId="8" w16cid:durableId="1846281192">
+  <w:num w:numId="8" w16cid:durableId="64305521">
     <w:abstractNumId w:val="17"/>
   </w:num>
-  <w:num w:numId="9" w16cid:durableId="1931431079">
+  <w:num w:numId="9" w16cid:durableId="615137417">
     <w:abstractNumId w:val="21"/>
   </w:num>
-  <w:num w:numId="10" w16cid:durableId="796139899">
+  <w:num w:numId="10" w16cid:durableId="1721250044">
     <w:abstractNumId w:val="22"/>
   </w:num>
-  <w:num w:numId="11" w16cid:durableId="750010519">
+  <w:num w:numId="11" w16cid:durableId="650330141">
     <w:abstractNumId w:val="12"/>
   </w:num>
-  <w:num w:numId="12" w16cid:durableId="1587766026">
+  <w:num w:numId="12" w16cid:durableId="1111827113">
     <w:abstractNumId w:val="24"/>
   </w:num>
-  <w:num w:numId="13" w16cid:durableId="925379412">
+  <w:num w:numId="13" w16cid:durableId="908927815">
     <w:abstractNumId w:val="11"/>
   </w:num>
-  <w:num w:numId="14" w16cid:durableId="1603805887">
+  <w:num w:numId="14" w16cid:durableId="1015234757">
     <w:abstractNumId w:val="14"/>
   </w:num>
-  <w:num w:numId="15" w16cid:durableId="1594972483">
+  <w:num w:numId="15" w16cid:durableId="1925063895">
     <w:abstractNumId w:val="18"/>
   </w:num>
-  <w:num w:numId="16" w16cid:durableId="591744509">
+  <w:num w:numId="16" w16cid:durableId="371077860">
     <w:abstractNumId w:val="3"/>
   </w:num>
-  <w:num w:numId="17" w16cid:durableId="926498134">
+  <w:num w:numId="17" w16cid:durableId="1340231965">
     <w:abstractNumId w:val="19"/>
   </w:num>
-  <w:num w:numId="18" w16cid:durableId="1035928464">
+  <w:num w:numId="18" w16cid:durableId="333804226">
     <w:abstractNumId w:val="1"/>
   </w:num>
-  <w:num w:numId="19" w16cid:durableId="143202167">
+  <w:num w:numId="19" w16cid:durableId="41949884">
     <w:abstractNumId w:val="27"/>
   </w:num>
-  <w:num w:numId="20" w16cid:durableId="1063216477">
+  <w:num w:numId="20" w16cid:durableId="950088291">
     <w:abstractNumId w:val="25"/>
   </w:num>
-  <w:num w:numId="21" w16cid:durableId="1360087002">
+  <w:num w:numId="21" w16cid:durableId="71901864">
     <w:abstractNumId w:val="10"/>
   </w:num>
-  <w:num w:numId="22" w16cid:durableId="1715764197">
+  <w:num w:numId="22" w16cid:durableId="1840122309">
     <w:abstractNumId w:val="0"/>
   </w:num>
-  <w:num w:numId="23" w16cid:durableId="763497253">
+  <w:num w:numId="23" w16cid:durableId="1478645022">
     <w:abstractNumId w:val="29"/>
   </w:num>
-  <w:num w:numId="24" w16cid:durableId="1104766460">
+  <w:num w:numId="24" w16cid:durableId="472606400">
     <w:abstractNumId w:val="8"/>
   </w:num>
-  <w:num w:numId="25" w16cid:durableId="1527909675">
+  <w:num w:numId="25" w16cid:durableId="1249122990">
     <w:abstractNumId w:val="23"/>
   </w:num>
-  <w:num w:numId="26" w16cid:durableId="413479026">
+  <w:num w:numId="26" w16cid:durableId="594289015">
     <w:abstractNumId w:val="9"/>
   </w:num>
-  <w:num w:numId="27" w16cid:durableId="426196660">
+  <w:num w:numId="27" w16cid:durableId="1178887125">
     <w:abstractNumId w:val="15"/>
   </w:num>
-  <w:num w:numId="28" w16cid:durableId="752552450">
+  <w:num w:numId="28" w16cid:durableId="706952891">
     <w:abstractNumId w:val="5"/>
   </w:num>
-  <w:num w:numId="29" w16cid:durableId="262735447">
+  <w:num w:numId="29" w16cid:durableId="2120373448">
     <w:abstractNumId w:val="26"/>
   </w:num>
-  <w:num w:numId="30" w16cid:durableId="748382647">
+  <w:num w:numId="30" w16cid:durableId="854921677">
     <w:abstractNumId w:val="16"/>
   </w:num>
 </w:numbering>
@@ -25943,7 +25956,7 @@
 </file>
 
 <file path=customXml/itemProps1.xml><?xml version="1.0" encoding="utf-8"?>
-<ds:datastoreItem xmlns:ds="http://schemas.openxmlformats.org/officeDocument/2006/customXml" ds:itemID="{6D367A29-5F7B-C54E-883B-3945A4FB4CFF}">
+<ds:datastoreItem xmlns:ds="http://schemas.openxmlformats.org/officeDocument/2006/customXml" ds:itemID="{539A20A1-BEB6-4C06-B920-9A1C7042220B}">
   <ds:schemaRefs>
     <ds:schemaRef ds:uri="http://schemas.openxmlformats.org/officeDocument/2006/bibliography"/>
   </ds:schemaRefs>

</xml_diff>